<commit_message>
Finalize evidence report and mask the API token in settings
</commit_message>
<xml_diff>
--- a/모바일웹서비스 프로젝트_공통평가 01_수행 결과 보고서.docx
+++ b/모바일웹서비스 프로젝트_공통평가 01_수행 결과 보고서.docx
@@ -1497,7 +1497,7 @@
               <w:rPr>
                 <w:sz w:val="14"/>
               </w:rPr>
-              <w:t>△</w:t>
+              <w:t>보완</w:t>
             </w:r>
           </w:p>
         </w:tc>
@@ -4991,14 +4991,54 @@
     </w:p>
     <w:p>
       <w:pPr>
+        <w:keepNext/>
+        <w:spacing w:after="80"/>
+      </w:pPr>
+      <w:r>
+        <w:drawing>
+          <wp:inline xmlns:a="http://schemas.openxmlformats.org/drawingml/2006/main" xmlns:pic="http://schemas.openxmlformats.org/drawingml/2006/picture">
+            <wp:extent cx="5849620" cy="3061293"/>
+            <wp:docPr id="1" name="Picture 1"/>
+            <wp:cNvGraphicFramePr>
+              <a:graphicFrameLocks noChangeAspect="1"/>
+            </wp:cNvGraphicFramePr>
+            <a:graphic>
+              <a:graphicData uri="http://schemas.openxmlformats.org/drawingml/2006/picture">
+                <pic:pic>
+                  <pic:nvPicPr>
+                    <pic:cNvPr id="0" name="repository.jpg"/>
+                    <pic:cNvPicPr/>
+                  </pic:nvPicPr>
+                  <pic:blipFill>
+                    <a:blip r:embed="rId14"/>
+                    <a:stretch>
+                      <a:fillRect/>
+                    </a:stretch>
+                  </pic:blipFill>
+                  <pic:spPr>
+                    <a:xfrm>
+                      <a:off x="0" y="0"/>
+                      <a:ext cx="5849620" cy="3061293"/>
+                    </a:xfrm>
+                    <a:prstGeom prst="rect"/>
+                  </pic:spPr>
+                </pic:pic>
+              </a:graphicData>
+            </a:graphic>
+          </wp:inline>
+        </w:drawing>
+      </w:r>
+    </w:p>
+    <w:p>
+      <w:pPr>
         <w:spacing w:before="0" w:after="120" w:line="264" w:lineRule="auto"/>
       </w:pPr>
       <w:r>
         <w:rPr>
           <w:b w:val="0"/>
-          <w:sz w:val="20"/>
+          <w:sz w:val="18"/>
         </w:rPr>
-        <w:t>저장소 구조 캡처는 최종 파일 업로드 후 삽입한다.</w:t>
+        <w:t>저장소 루트. PhotoBlogServer, PhotoViewer, 수행 결과 보고서와 evidence 폴더를 포함한다.</w:t>
       </w:r>
     </w:p>
     <w:p>
@@ -5065,7 +5105,7 @@
         <w:drawing>
           <wp:inline xmlns:a="http://schemas.openxmlformats.org/drawingml/2006/main" xmlns:pic="http://schemas.openxmlformats.org/drawingml/2006/picture">
             <wp:extent cx="5430931" cy="2834640"/>
-            <wp:docPr id="1" name="Picture 1"/>
+            <wp:docPr id="2" name="Picture 2"/>
             <wp:cNvGraphicFramePr>
               <a:graphicFrameLocks noChangeAspect="1"/>
             </wp:cNvGraphicFramePr>
@@ -5074,58 +5114,6 @@
                 <pic:pic>
                   <pic:nvPicPr>
                     <pic:cNvPr id="0" name="api-form.jpg"/>
-                    <pic:cNvPicPr/>
-                  </pic:nvPicPr>
-                  <pic:blipFill>
-                    <a:blip r:embed="rId14"/>
-                    <a:stretch>
-                      <a:fillRect/>
-                    </a:stretch>
-                  </pic:blipFill>
-                  <pic:spPr>
-                    <a:xfrm>
-                      <a:off x="0" y="0"/>
-                      <a:ext cx="5430931" cy="2834640"/>
-                    </a:xfrm>
-                    <a:prstGeom prst="rect"/>
-                  </pic:spPr>
-                </pic:pic>
-              </a:graphicData>
-            </a:graphic>
-          </wp:inline>
-        </w:drawing>
-      </w:r>
-    </w:p>
-    <w:p>
-      <w:pPr>
-        <w:spacing w:before="0" w:after="120" w:line="264" w:lineRule="auto"/>
-      </w:pPr>
-      <w:r>
-        <w:rPr>
-          <w:b w:val="0"/>
-          <w:sz w:val="18"/>
-        </w:rPr>
-        <w:t>사진 pig.png와 제목·본문을 입력한 REST framework HTML form.</w:t>
-      </w:r>
-    </w:p>
-    <w:p>
-      <w:pPr>
-        <w:keepNext/>
-        <w:spacing w:after="80"/>
-      </w:pPr>
-      <w:r>
-        <w:drawing>
-          <wp:inline xmlns:a="http://schemas.openxmlformats.org/drawingml/2006/main" xmlns:pic="http://schemas.openxmlformats.org/drawingml/2006/picture">
-            <wp:extent cx="5430931" cy="2834640"/>
-            <wp:docPr id="2" name="Picture 2"/>
-            <wp:cNvGraphicFramePr>
-              <a:graphicFrameLocks noChangeAspect="1"/>
-            </wp:cNvGraphicFramePr>
-            <a:graphic>
-              <a:graphicData uri="http://schemas.openxmlformats.org/drawingml/2006/picture">
-                <pic:pic>
-                  <pic:nvPicPr>
-                    <pic:cNvPr id="0" name="api-created.jpg"/>
                     <pic:cNvPicPr/>
                   </pic:nvPicPr>
                   <pic:blipFill>
@@ -5157,6 +5145,58 @@
           <w:b w:val="0"/>
           <w:sz w:val="18"/>
         </w:rPr>
+        <w:t>사진 pig.png와 제목·본문을 입력한 REST framework HTML form.</w:t>
+      </w:r>
+    </w:p>
+    <w:p>
+      <w:pPr>
+        <w:keepNext/>
+        <w:spacing w:after="80"/>
+      </w:pPr>
+      <w:r>
+        <w:drawing>
+          <wp:inline xmlns:a="http://schemas.openxmlformats.org/drawingml/2006/main" xmlns:pic="http://schemas.openxmlformats.org/drawingml/2006/picture">
+            <wp:extent cx="5430931" cy="2834640"/>
+            <wp:docPr id="3" name="Picture 3"/>
+            <wp:cNvGraphicFramePr>
+              <a:graphicFrameLocks noChangeAspect="1"/>
+            </wp:cNvGraphicFramePr>
+            <a:graphic>
+              <a:graphicData uri="http://schemas.openxmlformats.org/drawingml/2006/picture">
+                <pic:pic>
+                  <pic:nvPicPr>
+                    <pic:cNvPr id="0" name="api-created.jpg"/>
+                    <pic:cNvPicPr/>
+                  </pic:nvPicPr>
+                  <pic:blipFill>
+                    <a:blip r:embed="rId16"/>
+                    <a:stretch>
+                      <a:fillRect/>
+                    </a:stretch>
+                  </pic:blipFill>
+                  <pic:spPr>
+                    <a:xfrm>
+                      <a:off x="0" y="0"/>
+                      <a:ext cx="5430931" cy="2834640"/>
+                    </a:xfrm>
+                    <a:prstGeom prst="rect"/>
+                  </pic:spPr>
+                </pic:pic>
+              </a:graphicData>
+            </a:graphic>
+          </wp:inline>
+        </w:drawing>
+      </w:r>
+    </w:p>
+    <w:p>
+      <w:pPr>
+        <w:spacing w:before="0" w:after="120" w:line="264" w:lineRule="auto"/>
+      </w:pPr>
+      <w:r>
+        <w:rPr>
+          <w:b w:val="0"/>
+          <w:sz w:val="18"/>
+        </w:rPr>
         <w:t>HTTP 201 Created, 게시글 ID 3과 업로드 이미지 URL이 반환되었다.</w:t>
       </w:r>
     </w:p>
@@ -5212,7 +5252,7 @@
         <w:drawing>
           <wp:inline xmlns:a="http://schemas.openxmlformats.org/drawingml/2006/main" xmlns:pic="http://schemas.openxmlformats.org/drawingml/2006/picture">
             <wp:extent cx="5849620" cy="3049415"/>
-            <wp:docPr id="3" name="Picture 3"/>
+            <wp:docPr id="4" name="Picture 4"/>
             <wp:cNvGraphicFramePr>
               <a:graphicFrameLocks noChangeAspect="1"/>
             </wp:cNvGraphicFramePr>
@@ -5221,101 +5261,6 @@
                 <pic:pic>
                   <pic:nvPicPr>
                     <pic:cNvPr id="0" name="api-post-detail.jpg"/>
-                    <pic:cNvPicPr/>
-                  </pic:nvPicPr>
-                  <pic:blipFill>
-                    <a:blip r:embed="rId16"/>
-                    <a:stretch>
-                      <a:fillRect/>
-                    </a:stretch>
-                  </pic:blipFill>
-                  <pic:spPr>
-                    <a:xfrm>
-                      <a:off x="0" y="0"/>
-                      <a:ext cx="5849620" cy="3049415"/>
-                    </a:xfrm>
-                    <a:prstGeom prst="rect"/>
-                  </pic:spPr>
-                </pic:pic>
-              </a:graphicData>
-            </a:graphic>
-          </wp:inline>
-        </w:drawing>
-      </w:r>
-    </w:p>
-    <w:p>
-      <w:pPr>
-        <w:spacing w:before="0" w:after="120" w:line="264" w:lineRule="auto"/>
-      </w:pPr>
-      <w:r>
-        <w:rPr>
-          <w:b w:val="0"/>
-          <w:sz w:val="18"/>
-        </w:rPr>
-        <w:t>API에서 생성한 글의 제목, 게시글 ID와 이미지가 웹 상세 페이지에 표시된다.</w:t>
-      </w:r>
-    </w:p>
-    <w:p>
-      <w:pPr>
-        <w:spacing w:before="0" w:after="120" w:line="264" w:lineRule="auto"/>
-      </w:pPr>
-      <w:r>
-        <w:rPr>
-          <w:b w:val="0"/>
-          <w:sz w:val="22"/>
-        </w:rPr>
-        <w:t>요청의 multipart image 필드를 ImageField로 저장하며 author는 인증된 사용자로 설정한다. 생성·수정 웹 폼은 request.FILES와 multipart/form-data를 사용한다.</w:t>
-      </w:r>
-    </w:p>
-    <w:p>
-      <w:r>
-        <w:br w:type="page"/>
-      </w:r>
-    </w:p>
-    <w:p>
-      <w:pPr>
-        <w:pStyle w:val="aff8"/>
-        <w:keepNext/>
-        <w:spacing w:after="240"/>
-      </w:pPr>
-      <w:r>
-        <w:rPr>
-          <w:b/>
-          <w:sz w:val="28"/>
-        </w:rPr>
-        <w:t>증빙 3 API 콘솔 검증</w:t>
-      </w:r>
-    </w:p>
-    <w:p>
-      <w:pPr>
-        <w:spacing w:before="0" w:after="120" w:line="264" w:lineRule="auto"/>
-      </w:pPr>
-      <w:r>
-        <w:rPr>
-          <w:b w:val="0"/>
-          <w:sz w:val="22"/>
-        </w:rPr>
-        <w:t>PythonAnywhere Bash 콘솔에서 tools/verify_api.py로 배포 API를 실제 호출했다.</w:t>
-      </w:r>
-    </w:p>
-    <w:p>
-      <w:pPr>
-        <w:keepNext/>
-        <w:spacing w:after="80"/>
-      </w:pPr>
-      <w:r>
-        <w:drawing>
-          <wp:inline xmlns:a="http://schemas.openxmlformats.org/drawingml/2006/main" xmlns:pic="http://schemas.openxmlformats.org/drawingml/2006/picture">
-            <wp:extent cx="5849620" cy="3049415"/>
-            <wp:docPr id="4" name="Picture 4"/>
-            <wp:cNvGraphicFramePr>
-              <a:graphicFrameLocks noChangeAspect="1"/>
-            </wp:cNvGraphicFramePr>
-            <a:graphic>
-              <a:graphicData uri="http://schemas.openxmlformats.org/drawingml/2006/picture">
-                <pic:pic>
-                  <pic:nvPicPr>
-                    <pic:cNvPr id="0" name="api-console.jpg"/>
                     <pic:cNvPicPr/>
                   </pic:nvPicPr>
                   <pic:blipFill>
@@ -5347,6 +5292,101 @@
           <w:b w:val="0"/>
           <w:sz w:val="18"/>
         </w:rPr>
+        <w:t>API에서 생성한 글의 제목, 게시글 ID와 이미지가 웹 상세 페이지에 표시된다.</w:t>
+      </w:r>
+    </w:p>
+    <w:p>
+      <w:pPr>
+        <w:spacing w:before="0" w:after="120" w:line="264" w:lineRule="auto"/>
+      </w:pPr>
+      <w:r>
+        <w:rPr>
+          <w:b w:val="0"/>
+          <w:sz w:val="22"/>
+        </w:rPr>
+        <w:t>요청의 multipart image 필드를 ImageField로 저장하며 author는 인증된 사용자로 설정한다. 생성·수정 웹 폼은 request.FILES와 multipart/form-data를 사용한다.</w:t>
+      </w:r>
+    </w:p>
+    <w:p>
+      <w:r>
+        <w:br w:type="page"/>
+      </w:r>
+    </w:p>
+    <w:p>
+      <w:pPr>
+        <w:pStyle w:val="aff8"/>
+        <w:keepNext/>
+        <w:spacing w:after="240"/>
+      </w:pPr>
+      <w:r>
+        <w:rPr>
+          <w:b/>
+          <w:sz w:val="28"/>
+        </w:rPr>
+        <w:t>증빙 3 API 콘솔 검증</w:t>
+      </w:r>
+    </w:p>
+    <w:p>
+      <w:pPr>
+        <w:spacing w:before="0" w:after="120" w:line="264" w:lineRule="auto"/>
+      </w:pPr>
+      <w:r>
+        <w:rPr>
+          <w:b w:val="0"/>
+          <w:sz w:val="22"/>
+        </w:rPr>
+        <w:t>PythonAnywhere Bash 콘솔에서 tools/verify_api.py로 배포 API를 실제 호출했다.</w:t>
+      </w:r>
+    </w:p>
+    <w:p>
+      <w:pPr>
+        <w:keepNext/>
+        <w:spacing w:after="80"/>
+      </w:pPr>
+      <w:r>
+        <w:drawing>
+          <wp:inline xmlns:a="http://schemas.openxmlformats.org/drawingml/2006/main" xmlns:pic="http://schemas.openxmlformats.org/drawingml/2006/picture">
+            <wp:extent cx="5849620" cy="3049415"/>
+            <wp:docPr id="5" name="Picture 5"/>
+            <wp:cNvGraphicFramePr>
+              <a:graphicFrameLocks noChangeAspect="1"/>
+            </wp:cNvGraphicFramePr>
+            <a:graphic>
+              <a:graphicData uri="http://schemas.openxmlformats.org/drawingml/2006/picture">
+                <pic:pic>
+                  <pic:nvPicPr>
+                    <pic:cNvPr id="0" name="api-console.jpg"/>
+                    <pic:cNvPicPr/>
+                  </pic:nvPicPr>
+                  <pic:blipFill>
+                    <a:blip r:embed="rId18"/>
+                    <a:stretch>
+                      <a:fillRect/>
+                    </a:stretch>
+                  </pic:blipFill>
+                  <pic:spPr>
+                    <a:xfrm>
+                      <a:off x="0" y="0"/>
+                      <a:ext cx="5849620" cy="3049415"/>
+                    </a:xfrm>
+                    <a:prstGeom prst="rect"/>
+                  </pic:spPr>
+                </pic:pic>
+              </a:graphicData>
+            </a:graphic>
+          </wp:inline>
+        </w:drawing>
+      </w:r>
+    </w:p>
+    <w:p>
+      <w:pPr>
+        <w:spacing w:before="0" w:after="120" w:line="264" w:lineRule="auto"/>
+      </w:pPr>
+      <w:r>
+        <w:rPr>
+          <w:b w:val="0"/>
+          <w:sz w:val="18"/>
+        </w:rPr>
         <w:t>GET → HTTP 200 → application/json → JSON 배열과 필수 필드 검증 성공.</w:t>
       </w:r>
     </w:p>
@@ -5414,7 +5454,7 @@
         <w:drawing>
           <wp:inline xmlns:a="http://schemas.openxmlformats.org/drawingml/2006/main" xmlns:pic="http://schemas.openxmlformats.org/drawingml/2006/picture">
             <wp:extent cx="5849620" cy="3053172"/>
-            <wp:docPr id="5" name="Picture 5"/>
+            <wp:docPr id="6" name="Picture 6"/>
             <wp:cNvGraphicFramePr>
               <a:graphicFrameLocks noChangeAspect="1"/>
             </wp:cNvGraphicFramePr>
@@ -5426,7 +5466,7 @@
                     <pic:cNvPicPr/>
                   </pic:nvPicPr>
                   <pic:blipFill>
-                    <a:blip r:embed="rId18"/>
+                    <a:blip r:embed="rId19"/>
                     <a:stretch>
                       <a:fillRect/>
                     </a:stretch>
@@ -5497,7 +5537,7 @@
         <w:drawing>
           <wp:inline xmlns:a="http://schemas.openxmlformats.org/drawingml/2006/main" xmlns:pic="http://schemas.openxmlformats.org/drawingml/2006/picture">
             <wp:extent cx="5849620" cy="3049415"/>
-            <wp:docPr id="6" name="Picture 6"/>
+            <wp:docPr id="7" name="Picture 7"/>
             <wp:cNvGraphicFramePr>
               <a:graphicFrameLocks noChangeAspect="1"/>
             </wp:cNvGraphicFramePr>
@@ -5506,125 +5546,6 @@
                 <pic:pic>
                   <pic:nvPicPr>
                     <pic:cNvPr id="0" name="coverage.jpg"/>
-                    <pic:cNvPicPr/>
-                  </pic:nvPicPr>
-                  <pic:blipFill>
-                    <a:blip r:embed="rId19"/>
-                    <a:stretch>
-                      <a:fillRect/>
-                    </a:stretch>
-                  </pic:blipFill>
-                  <pic:spPr>
-                    <a:xfrm>
-                      <a:off x="0" y="0"/>
-                      <a:ext cx="5849620" cy="3049415"/>
-                    </a:xfrm>
-                    <a:prstGeom prst="rect"/>
-                  </pic:spPr>
-                </pic:pic>
-              </a:graphicData>
-            </a:graphic>
-          </wp:inline>
-        </w:drawing>
-      </w:r>
-    </w:p>
-    <w:p>
-      <w:pPr>
-        <w:spacing w:before="0" w:after="120" w:line="264" w:lineRule="auto"/>
-      </w:pPr>
-      <w:r>
-        <w:rPr>
-          <w:b w:val="0"/>
-          <w:sz w:val="18"/>
-        </w:rPr>
-        <w:t>coverage.py HTML 보고서: 지정한 blog 코드의 실행문과 분기 모두 100%.</w:t>
-      </w:r>
-    </w:p>
-    <w:p>
-      <w:pPr>
-        <w:spacing w:before="0" w:after="120" w:line="264" w:lineRule="auto"/>
-      </w:pPr>
-      <w:r>
-        <w:rPr>
-          <w:b w:val="0"/>
-          <w:sz w:val="20"/>
-        </w:rPr>
-        <w:t>실행: python -m coverage run manage.py test blog -v 2</w:t>
-      </w:r>
-    </w:p>
-    <w:p>
-      <w:pPr>
-        <w:spacing w:before="0" w:after="120" w:line="264" w:lineRule="auto"/>
-      </w:pPr>
-      <w:r>
-        <w:rPr>
-          <w:b w:val="0"/>
-          <w:sz w:val="22"/>
-        </w:rPr>
-        <w:t>15개 테스트가 모두 통과했다. 조회·검색·404, 인증 토큰, 정상 multipart 이미지 저장, 빈 제목·누락 이미지·위조 이미지·용량·형식 오류, 다른 작성자 위조, 소유권, 수정·삭제, 웹 폼과 모델을 검사했다.</w:t>
-      </w:r>
-    </w:p>
-    <w:p>
-      <w:pPr>
-        <w:spacing w:before="0" w:after="120" w:line="264" w:lineRule="auto"/>
-      </w:pPr>
-      <w:r>
-        <w:rPr>
-          <w:b w:val="0"/>
-          <w:sz w:val="20"/>
-        </w:rPr>
-        <w:t>범위: blog의 98개 실행문과 12개 분기. 테스트 코드, 마이그레이션, 초기 데이터 명령은 제외했다. Android 코드 전체의 커버리지 수치로 해석하지 않는다.</w:t>
-      </w:r>
-    </w:p>
-    <w:p>
-      <w:pPr>
-        <w:spacing w:before="0" w:after="120" w:line="264" w:lineRule="auto"/>
-      </w:pPr>
-      <w:r>
-        <w:rPr>
-          <w:b w:val="0"/>
-          <w:sz w:val="20"/>
-        </w:rPr>
-        <w:t>소스: PhotoBlogServer/blog/tests.py · 설정: .coveragerc · 재실행 방법: README.</w:t>
-      </w:r>
-    </w:p>
-    <w:p>
-      <w:r>
-        <w:br w:type="page"/>
-      </w:r>
-    </w:p>
-    <w:p>
-      <w:pPr>
-        <w:pStyle w:val="aff8"/>
-        <w:keepNext/>
-        <w:spacing w:after="240"/>
-      </w:pPr>
-      <w:r>
-        <w:rPr>
-          <w:b/>
-          <w:sz w:val="28"/>
-        </w:rPr>
-        <w:t>증빙 6 소켓으로 받은 Android 요청</w:t>
-      </w:r>
-    </w:p>
-    <w:p>
-      <w:pPr>
-        <w:keepNext/>
-        <w:spacing w:after="80"/>
-      </w:pPr>
-      <w:r>
-        <w:drawing>
-          <wp:inline xmlns:a="http://schemas.openxmlformats.org/drawingml/2006/main" xmlns:pic="http://schemas.openxmlformats.org/drawingml/2006/picture">
-            <wp:extent cx="5849620" cy="3049415"/>
-            <wp:docPr id="7" name="Picture 7"/>
-            <wp:cNvGraphicFramePr>
-              <a:graphicFrameLocks noChangeAspect="1"/>
-            </wp:cNvGraphicFramePr>
-            <a:graphic>
-              <a:graphicData uri="http://schemas.openxmlformats.org/drawingml/2006/picture">
-                <pic:pic>
-                  <pic:nvPicPr>
-                    <pic:cNvPr id="0" name="socket-vscode.jpg"/>
                     <pic:cNvPicPr/>
                   </pic:nvPicPr>
                   <pic:blipFill>
@@ -5656,6 +5577,125 @@
           <w:b w:val="0"/>
           <w:sz w:val="18"/>
         </w:rPr>
+        <w:t>coverage.py HTML 보고서: 지정한 blog 코드의 실행문과 분기 모두 100%.</w:t>
+      </w:r>
+    </w:p>
+    <w:p>
+      <w:pPr>
+        <w:spacing w:before="0" w:after="120" w:line="264" w:lineRule="auto"/>
+      </w:pPr>
+      <w:r>
+        <w:rPr>
+          <w:b w:val="0"/>
+          <w:sz w:val="20"/>
+        </w:rPr>
+        <w:t>실행: python -m coverage run manage.py test blog -v 2</w:t>
+      </w:r>
+    </w:p>
+    <w:p>
+      <w:pPr>
+        <w:spacing w:before="0" w:after="120" w:line="264" w:lineRule="auto"/>
+      </w:pPr>
+      <w:r>
+        <w:rPr>
+          <w:b w:val="0"/>
+          <w:sz w:val="22"/>
+        </w:rPr>
+        <w:t>15개 테스트가 모두 통과했다. 조회·검색·404, 인증 토큰, 정상 multipart 이미지 저장, 빈 제목·누락 이미지·위조 이미지·용량·형식 오류, 다른 작성자 위조, 소유권, 수정·삭제, 웹 폼과 모델을 검사했다.</w:t>
+      </w:r>
+    </w:p>
+    <w:p>
+      <w:pPr>
+        <w:spacing w:before="0" w:after="120" w:line="264" w:lineRule="auto"/>
+      </w:pPr>
+      <w:r>
+        <w:rPr>
+          <w:b w:val="0"/>
+          <w:sz w:val="20"/>
+        </w:rPr>
+        <w:t>범위: blog의 98개 실행문과 12개 분기. 테스트 코드, 마이그레이션, 초기 데이터 명령은 제외했다. Android 코드 전체의 커버리지 수치로 해석하지 않는다.</w:t>
+      </w:r>
+    </w:p>
+    <w:p>
+      <w:pPr>
+        <w:spacing w:before="0" w:after="120" w:line="264" w:lineRule="auto"/>
+      </w:pPr>
+      <w:r>
+        <w:rPr>
+          <w:b w:val="0"/>
+          <w:sz w:val="20"/>
+        </w:rPr>
+        <w:t>소스: PhotoBlogServer/blog/tests.py · 설정: .coveragerc · 재실행 방법: README.</w:t>
+      </w:r>
+    </w:p>
+    <w:p>
+      <w:r>
+        <w:br w:type="page"/>
+      </w:r>
+    </w:p>
+    <w:p>
+      <w:pPr>
+        <w:pStyle w:val="aff8"/>
+        <w:keepNext/>
+        <w:spacing w:after="240"/>
+      </w:pPr>
+      <w:r>
+        <w:rPr>
+          <w:b/>
+          <w:sz w:val="28"/>
+        </w:rPr>
+        <w:t>증빙 6 소켓으로 받은 Android 요청</w:t>
+      </w:r>
+    </w:p>
+    <w:p>
+      <w:pPr>
+        <w:keepNext/>
+        <w:spacing w:after="80"/>
+      </w:pPr>
+      <w:r>
+        <w:drawing>
+          <wp:inline xmlns:a="http://schemas.openxmlformats.org/drawingml/2006/main" xmlns:pic="http://schemas.openxmlformats.org/drawingml/2006/picture">
+            <wp:extent cx="5849620" cy="3049415"/>
+            <wp:docPr id="8" name="Picture 8"/>
+            <wp:cNvGraphicFramePr>
+              <a:graphicFrameLocks noChangeAspect="1"/>
+            </wp:cNvGraphicFramePr>
+            <a:graphic>
+              <a:graphicData uri="http://schemas.openxmlformats.org/drawingml/2006/picture">
+                <pic:pic>
+                  <pic:nvPicPr>
+                    <pic:cNvPr id="0" name="socket-vscode.jpg"/>
+                    <pic:cNvPicPr/>
+                  </pic:nvPicPr>
+                  <pic:blipFill>
+                    <a:blip r:embed="rId21"/>
+                    <a:stretch>
+                      <a:fillRect/>
+                    </a:stretch>
+                  </pic:blipFill>
+                  <pic:spPr>
+                    <a:xfrm>
+                      <a:off x="0" y="0"/>
+                      <a:ext cx="5849620" cy="3049415"/>
+                    </a:xfrm>
+                    <a:prstGeom prst="rect"/>
+                  </pic:spPr>
+                </pic:pic>
+              </a:graphicData>
+            </a:graphic>
+          </wp:inline>
+        </w:drawing>
+      </w:r>
+    </w:p>
+    <w:p>
+      <w:pPr>
+        <w:spacing w:before="0" w:after="120" w:line="264" w:lineRule="auto"/>
+      </w:pPr>
+      <w:r>
+        <w:rPr>
+          <w:b w:val="0"/>
+          <w:sz w:val="18"/>
+        </w:rPr>
         <w:t>수신 파일 android-request.txt의 원문을 VS Code 웹 편집기에 붙여 확인한 화면.</w:t>
       </w:r>
     </w:p>
@@ -5737,7 +5777,7 @@
         <w:drawing>
           <wp:inline xmlns:a="http://schemas.openxmlformats.org/drawingml/2006/main" xmlns:pic="http://schemas.openxmlformats.org/drawingml/2006/picture">
             <wp:extent cx="5849620" cy="3053172"/>
-            <wp:docPr id="8" name="Picture 8"/>
+            <wp:docPr id="9" name="Picture 9"/>
             <wp:cNvGraphicFramePr>
               <a:graphicFrameLocks noChangeAspect="1"/>
             </wp:cNvGraphicFramePr>
@@ -5749,7 +5789,7 @@
                     <pic:cNvPicPr/>
                   </pic:nvPicPr>
                   <pic:blipFill>
-                    <a:blip r:embed="rId21"/>
+                    <a:blip r:embed="rId22"/>
                     <a:stretch>
                       <a:fillRect/>
                     </a:stretch>
@@ -5821,7 +5861,7 @@
         <w:drawing>
           <wp:inline xmlns:a="http://schemas.openxmlformats.org/drawingml/2006/main" xmlns:pic="http://schemas.openxmlformats.org/drawingml/2006/picture">
             <wp:extent cx="2432304" cy="5405120"/>
-            <wp:docPr id="9" name="Picture 9"/>
+            <wp:docPr id="10" name="Picture 10"/>
             <wp:cNvGraphicFramePr>
               <a:graphicFrameLocks noChangeAspect="1"/>
             </wp:cNvGraphicFramePr>
@@ -5833,7 +5873,7 @@
                     <pic:cNvPicPr/>
                   </pic:nvPicPr>
                   <pic:blipFill>
-                    <a:blip r:embed="rId22"/>
+                    <a:blip r:embed="rId23"/>
                     <a:stretch>
                       <a:fillRect/>
                     </a:stretch>
@@ -5858,7 +5898,7 @@
         <w:drawing>
           <wp:inline xmlns:a="http://schemas.openxmlformats.org/drawingml/2006/main" xmlns:pic="http://schemas.openxmlformats.org/drawingml/2006/picture">
             <wp:extent cx="2432304" cy="5405120"/>
-            <wp:docPr id="10" name="Picture 10"/>
+            <wp:docPr id="11" name="Picture 11"/>
             <wp:cNvGraphicFramePr>
               <a:graphicFrameLocks noChangeAspect="1"/>
             </wp:cNvGraphicFramePr>
@@ -5870,7 +5910,7 @@
                     <pic:cNvPicPr/>
                   </pic:nvPicPr>
                   <pic:blipFill>
-                    <a:blip r:embed="rId23"/>
+                    <a:blip r:embed="rId24"/>
                     <a:stretch>
                       <a:fillRect/>
                     </a:stretch>
@@ -5942,7 +5982,7 @@
         <w:drawing>
           <wp:inline xmlns:a="http://schemas.openxmlformats.org/drawingml/2006/main" xmlns:pic="http://schemas.openxmlformats.org/drawingml/2006/picture">
             <wp:extent cx="2432304" cy="5405120"/>
-            <wp:docPr id="11" name="Picture 11"/>
+            <wp:docPr id="12" name="Picture 12"/>
             <wp:cNvGraphicFramePr>
               <a:graphicFrameLocks noChangeAspect="1"/>
             </wp:cNvGraphicFramePr>
@@ -5954,7 +5994,7 @@
                     <pic:cNvPicPr/>
                   </pic:nvPicPr>
                   <pic:blipFill>
-                    <a:blip r:embed="rId24"/>
+                    <a:blip r:embed="rId25"/>
                     <a:stretch>
                       <a:fillRect/>
                     </a:stretch>
@@ -5979,7 +6019,7 @@
         <w:drawing>
           <wp:inline xmlns:a="http://schemas.openxmlformats.org/drawingml/2006/main" xmlns:pic="http://schemas.openxmlformats.org/drawingml/2006/picture">
             <wp:extent cx="2432304" cy="5405120"/>
-            <wp:docPr id="12" name="Picture 12"/>
+            <wp:docPr id="13" name="Picture 13"/>
             <wp:cNvGraphicFramePr>
               <a:graphicFrameLocks noChangeAspect="1"/>
             </wp:cNvGraphicFramePr>
@@ -5991,7 +6031,7 @@
                     <pic:cNvPicPr/>
                   </pic:nvPicPr>
                   <pic:blipFill>
-                    <a:blip r:embed="rId25"/>
+                    <a:blip r:embed="rId26"/>
                     <a:stretch>
                       <a:fillRect/>
                     </a:stretch>
@@ -6062,7 +6102,7 @@
           <w:b/>
           <w:sz w:val="28"/>
         </w:rPr>
-        <w:t>증빙 10 PythonAnywhere 서버와 클라이언트</w:t>
+        <w:t>증빙 10 PythonAnywhere 서버</w:t>
       </w:r>
     </w:p>
     <w:p>
@@ -6073,8 +6113,8 @@
       <w:r>
         <w:drawing>
           <wp:inline xmlns:a="http://schemas.openxmlformats.org/drawingml/2006/main" xmlns:pic="http://schemas.openxmlformats.org/drawingml/2006/picture">
-            <wp:extent cx="5080549" cy="2651760"/>
-            <wp:docPr id="13" name="Picture 13"/>
+            <wp:extent cx="5849620" cy="3053172"/>
+            <wp:docPr id="14" name="Picture 14"/>
             <wp:cNvGraphicFramePr>
               <a:graphicFrameLocks noChangeAspect="1"/>
             </wp:cNvGraphicFramePr>
@@ -6086,7 +6126,7 @@
                     <pic:cNvPicPr/>
                   </pic:nvPicPr>
                   <pic:blipFill>
-                    <a:blip r:embed="rId26"/>
+                    <a:blip r:embed="rId27"/>
                     <a:stretch>
                       <a:fillRect/>
                     </a:stretch>
@@ -6094,7 +6134,7 @@
                   <pic:spPr>
                     <a:xfrm>
                       <a:off x="0" y="0"/>
-                      <a:ext cx="5080549" cy="2651760"/>
+                      <a:ext cx="5849620" cy="3053172"/>
                     </a:xfrm>
                     <a:prstGeom prst="rect"/>
                   </pic:spPr>
@@ -6115,58 +6155,6 @@
           <w:sz w:val="18"/>
         </w:rPr>
         <w:t>클라우드 웹: https://gyusik.pythonanywhere.com/</w:t>
-      </w:r>
-    </w:p>
-    <w:p>
-      <w:pPr>
-        <w:keepNext/>
-        <w:spacing w:after="80"/>
-      </w:pPr>
-      <w:r>
-        <w:drawing>
-          <wp:inline xmlns:a="http://schemas.openxmlformats.org/drawingml/2006/main" xmlns:pic="http://schemas.openxmlformats.org/drawingml/2006/picture">
-            <wp:extent cx="1892807" cy="4206238"/>
-            <wp:docPr id="14" name="Picture 14"/>
-            <wp:cNvGraphicFramePr>
-              <a:graphicFrameLocks noChangeAspect="1"/>
-            </wp:cNvGraphicFramePr>
-            <a:graphic>
-              <a:graphicData uri="http://schemas.openxmlformats.org/drawingml/2006/picture">
-                <pic:pic>
-                  <pic:nvPicPr>
-                    <pic:cNvPr id="0" name="cloud-synced.png"/>
-                    <pic:cNvPicPr/>
-                  </pic:nvPicPr>
-                  <pic:blipFill>
-                    <a:blip r:embed="rId27"/>
-                    <a:stretch>
-                      <a:fillRect/>
-                    </a:stretch>
-                  </pic:blipFill>
-                  <pic:spPr>
-                    <a:xfrm>
-                      <a:off x="0" y="0"/>
-                      <a:ext cx="1892807" cy="4206238"/>
-                    </a:xfrm>
-                    <a:prstGeom prst="rect"/>
-                  </pic:spPr>
-                </pic:pic>
-              </a:graphicData>
-            </a:graphic>
-          </wp:inline>
-        </w:drawing>
-      </w:r>
-    </w:p>
-    <w:p>
-      <w:pPr>
-        <w:spacing w:before="0" w:after="120" w:line="264" w:lineRule="auto"/>
-      </w:pPr>
-      <w:r>
-        <w:rPr>
-          <w:b w:val="0"/>
-          <w:sz w:val="18"/>
-        </w:rPr>
-        <w:t>Android 설정의 클라우드 주소로 접속해 HTTPS 동기화 완료.</w:t>
       </w:r>
     </w:p>
     <w:p>
@@ -6197,6 +6185,89 @@
           <w:b/>
           <w:sz w:val="28"/>
         </w:rPr>
+        <w:t>증빙 10 클라우드 동기화 결과</w:t>
+      </w:r>
+    </w:p>
+    <w:p>
+      <w:pPr>
+        <w:keepNext/>
+        <w:spacing w:after="80"/>
+      </w:pPr>
+      <w:r>
+        <w:drawing>
+          <wp:inline xmlns:a="http://schemas.openxmlformats.org/drawingml/2006/main" xmlns:pic="http://schemas.openxmlformats.org/drawingml/2006/picture">
+            <wp:extent cx="2592324" cy="5760720"/>
+            <wp:docPr id="15" name="Picture 15"/>
+            <wp:cNvGraphicFramePr>
+              <a:graphicFrameLocks noChangeAspect="1"/>
+            </wp:cNvGraphicFramePr>
+            <a:graphic>
+              <a:graphicData uri="http://schemas.openxmlformats.org/drawingml/2006/picture">
+                <pic:pic>
+                  <pic:nvPicPr>
+                    <pic:cNvPr id="0" name="cloud-synced.png"/>
+                    <pic:cNvPicPr/>
+                  </pic:nvPicPr>
+                  <pic:blipFill>
+                    <a:blip r:embed="rId28"/>
+                    <a:stretch>
+                      <a:fillRect/>
+                    </a:stretch>
+                  </pic:blipFill>
+                  <pic:spPr>
+                    <a:xfrm>
+                      <a:off x="0" y="0"/>
+                      <a:ext cx="2592324" cy="5760720"/>
+                    </a:xfrm>
+                    <a:prstGeom prst="rect"/>
+                  </pic:spPr>
+                </pic:pic>
+              </a:graphicData>
+            </a:graphic>
+          </wp:inline>
+        </w:drawing>
+      </w:r>
+    </w:p>
+    <w:p>
+      <w:pPr>
+        <w:spacing w:before="0" w:after="120" w:line="264" w:lineRule="auto"/>
+      </w:pPr>
+      <w:r>
+        <w:rPr>
+          <w:b w:val="0"/>
+          <w:sz w:val="18"/>
+        </w:rPr>
+        <w:t>Android 설정의 클라우드 주소로 접속해 HTTPS 동기화 완료.</w:t>
+      </w:r>
+    </w:p>
+    <w:p>
+      <w:pPr>
+        <w:spacing w:before="0" w:after="120" w:line="264" w:lineRule="auto"/>
+      </w:pPr>
+      <w:r>
+        <w:rPr>
+          <w:b w:val="0"/>
+          <w:sz w:val="20"/>
+        </w:rPr>
+        <w:t>에뮬레이터에서 공개 HTTPS API를 호출해 게시글 JSON과 이미지를 함께 내려받았다.</w:t>
+      </w:r>
+    </w:p>
+    <w:p>
+      <w:r>
+        <w:br w:type="page"/>
+      </w:r>
+    </w:p>
+    <w:p>
+      <w:pPr>
+        <w:pStyle w:val="aff8"/>
+        <w:keepNext/>
+        <w:spacing w:after="240"/>
+      </w:pPr>
+      <w:r>
+        <w:rPr>
+          <w:b/>
+          <w:sz w:val="28"/>
+        </w:rPr>
         <w:t>증빙 11 연결 설정과 검색</w:t>
       </w:r>
     </w:p>
@@ -6210,7 +6281,7 @@
         <w:drawing>
           <wp:inline xmlns:a="http://schemas.openxmlformats.org/drawingml/2006/main" xmlns:pic="http://schemas.openxmlformats.org/drawingml/2006/picture">
             <wp:extent cx="2432304" cy="5405120"/>
-            <wp:docPr id="15" name="Picture 15"/>
+            <wp:docPr id="16" name="Picture 16"/>
             <wp:cNvGraphicFramePr>
               <a:graphicFrameLocks noChangeAspect="1"/>
             </wp:cNvGraphicFramePr>
@@ -6222,7 +6293,7 @@
                     <pic:cNvPicPr/>
                   </pic:nvPicPr>
                   <pic:blipFill>
-                    <a:blip r:embed="rId28"/>
+                    <a:blip r:embed="rId29"/>
                     <a:stretch>
                       <a:fillRect/>
                     </a:stretch>
@@ -6247,7 +6318,7 @@
         <w:drawing>
           <wp:inline xmlns:a="http://schemas.openxmlformats.org/drawingml/2006/main" xmlns:pic="http://schemas.openxmlformats.org/drawingml/2006/picture">
             <wp:extent cx="2432304" cy="5405120"/>
-            <wp:docPr id="16" name="Picture 16"/>
+            <wp:docPr id="17" name="Picture 17"/>
             <wp:cNvGraphicFramePr>
               <a:graphicFrameLocks noChangeAspect="1"/>
             </wp:cNvGraphicFramePr>
@@ -6259,7 +6330,7 @@
                     <pic:cNvPicPr/>
                   </pic:nvPicPr>
                   <pic:blipFill>
-                    <a:blip r:embed="rId29"/>
+                    <a:blip r:embed="rId30"/>
                     <a:stretch>
                       <a:fillRect/>
                     </a:stretch>
@@ -6331,7 +6402,7 @@
         <w:drawing>
           <wp:inline xmlns:a="http://schemas.openxmlformats.org/drawingml/2006/main" xmlns:pic="http://schemas.openxmlformats.org/drawingml/2006/picture">
             <wp:extent cx="2432304" cy="5405120"/>
-            <wp:docPr id="17" name="Picture 17"/>
+            <wp:docPr id="18" name="Picture 18"/>
             <wp:cNvGraphicFramePr>
               <a:graphicFrameLocks noChangeAspect="1"/>
             </wp:cNvGraphicFramePr>
@@ -6343,7 +6414,7 @@
                     <pic:cNvPicPr/>
                   </pic:nvPicPr>
                   <pic:blipFill>
-                    <a:blip r:embed="rId30"/>
+                    <a:blip r:embed="rId31"/>
                     <a:stretch>
                       <a:fillRect/>
                     </a:stretch>
@@ -6368,7 +6439,7 @@
         <w:drawing>
           <wp:inline xmlns:a="http://schemas.openxmlformats.org/drawingml/2006/main" xmlns:pic="http://schemas.openxmlformats.org/drawingml/2006/picture">
             <wp:extent cx="2432304" cy="5405120"/>
-            <wp:docPr id="18" name="Picture 18"/>
+            <wp:docPr id="19" name="Picture 19"/>
             <wp:cNvGraphicFramePr>
               <a:graphicFrameLocks noChangeAspect="1"/>
             </wp:cNvGraphicFramePr>
@@ -6380,7 +6451,7 @@
                     <pic:cNvPicPr/>
                   </pic:nvPicPr>
                   <pic:blipFill>
-                    <a:blip r:embed="rId31"/>
+                    <a:blip r:embed="rId32"/>
                     <a:stretch>
                       <a:fillRect/>
                     </a:stretch>
@@ -6451,7 +6522,7 @@
         <w:drawing>
           <wp:inline xmlns:a="http://schemas.openxmlformats.org/drawingml/2006/main" xmlns:pic="http://schemas.openxmlformats.org/drawingml/2006/picture">
             <wp:extent cx="2592324" cy="5760720"/>
-            <wp:docPr id="19" name="Picture 19"/>
+            <wp:docPr id="20" name="Picture 20"/>
             <wp:cNvGraphicFramePr>
               <a:graphicFrameLocks noChangeAspect="1"/>
             </wp:cNvGraphicFramePr>
@@ -6463,7 +6534,7 @@
                     <pic:cNvPicPr/>
                   </pic:nvPicPr>
                   <pic:blipFill>
-                    <a:blip r:embed="rId32"/>
+                    <a:blip r:embed="rId33"/>
                     <a:stretch>
                       <a:fillRect/>
                     </a:stretch>

</xml_diff>

<commit_message>
Refresh all evaluation evidence and report with supplied cat images
</commit_message>
<xml_diff>
--- a/모바일웹서비스 프로젝트_공통평가 01_수행 결과 보고서.docx
+++ b/모바일웹서비스 프로젝트_공통평가 01_수행 결과 보고서.docx
@@ -4997,7 +4997,7 @@
       <w:r>
         <w:drawing>
           <wp:inline xmlns:a="http://schemas.openxmlformats.org/drawingml/2006/main" xmlns:pic="http://schemas.openxmlformats.org/drawingml/2006/picture">
-            <wp:extent cx="5849620" cy="3061293"/>
+            <wp:extent cx="3309728" cy="3474719"/>
             <wp:docPr id="1" name="Picture 1"/>
             <wp:cNvGraphicFramePr>
               <a:graphicFrameLocks noChangeAspect="1"/>
@@ -5018,7 +5018,7 @@
                   <pic:spPr>
                     <a:xfrm>
                       <a:off x="0" y="0"/>
-                      <a:ext cx="5849620" cy="3061293"/>
+                      <a:ext cx="3309728" cy="3474719"/>
                     </a:xfrm>
                     <a:prstGeom prst="rect"/>
                   </pic:spPr>
@@ -5104,7 +5104,7 @@
       <w:r>
         <w:drawing>
           <wp:inline xmlns:a="http://schemas.openxmlformats.org/drawingml/2006/main" xmlns:pic="http://schemas.openxmlformats.org/drawingml/2006/picture">
-            <wp:extent cx="5430931" cy="2834640"/>
+            <wp:extent cx="5016644" cy="2834640"/>
             <wp:docPr id="2" name="Picture 2"/>
             <wp:cNvGraphicFramePr>
               <a:graphicFrameLocks noChangeAspect="1"/>
@@ -5125,7 +5125,7 @@
                   <pic:spPr>
                     <a:xfrm>
                       <a:off x="0" y="0"/>
-                      <a:ext cx="5430931" cy="2834640"/>
+                      <a:ext cx="5016644" cy="2834640"/>
                     </a:xfrm>
                     <a:prstGeom prst="rect"/>
                   </pic:spPr>
@@ -5145,7 +5145,7 @@
           <w:b w:val="0"/>
           <w:sz w:val="18"/>
         </w:rPr>
-        <w:t>사진 pig.png와 제목·본문을 입력한 REST framework HTML form.</w:t>
+        <w:t>사진 cat_annoyed.png와 제목·본문을 입력한 REST framework HTML form.</w:t>
       </w:r>
     </w:p>
     <w:p>
@@ -5156,7 +5156,7 @@
       <w:r>
         <w:drawing>
           <wp:inline xmlns:a="http://schemas.openxmlformats.org/drawingml/2006/main" xmlns:pic="http://schemas.openxmlformats.org/drawingml/2006/picture">
-            <wp:extent cx="5430931" cy="2834640"/>
+            <wp:extent cx="5016644" cy="2834640"/>
             <wp:docPr id="3" name="Picture 3"/>
             <wp:cNvGraphicFramePr>
               <a:graphicFrameLocks noChangeAspect="1"/>
@@ -5177,7 +5177,7 @@
                   <pic:spPr>
                     <a:xfrm>
                       <a:off x="0" y="0"/>
-                      <a:ext cx="5430931" cy="2834640"/>
+                      <a:ext cx="5016644" cy="2834640"/>
                     </a:xfrm>
                     <a:prstGeom prst="rect"/>
                   </pic:spPr>
@@ -5197,7 +5197,7 @@
           <w:b w:val="0"/>
           <w:sz w:val="18"/>
         </w:rPr>
-        <w:t>HTTP 201 Created, 게시글 ID 3과 업로드 이미지 URL이 반환되었다.</w:t>
+        <w:t>HTTP 201 Created, 게시글 ID 5와 업로드 이미지 URL이 반환되었다.</w:t>
       </w:r>
     </w:p>
     <w:p>
@@ -5240,7 +5240,7 @@
           <w:b w:val="0"/>
           <w:sz w:val="20"/>
         </w:rPr>
-        <w:t>게시글 URL: http://127.0.0.1:8000/post/3/</w:t>
+        <w:t>게시글 URL: http://127.0.0.1:8000/post/5/</w:t>
       </w:r>
     </w:p>
     <w:p>
@@ -5251,7 +5251,7 @@
       <w:r>
         <w:drawing>
           <wp:inline xmlns:a="http://schemas.openxmlformats.org/drawingml/2006/main" xmlns:pic="http://schemas.openxmlformats.org/drawingml/2006/picture">
-            <wp:extent cx="5849620" cy="3049415"/>
+            <wp:extent cx="5849620" cy="3303155"/>
             <wp:docPr id="4" name="Picture 4"/>
             <wp:cNvGraphicFramePr>
               <a:graphicFrameLocks noChangeAspect="1"/>
@@ -5272,7 +5272,7 @@
                   <pic:spPr>
                     <a:xfrm>
                       <a:off x="0" y="0"/>
-                      <a:ext cx="5849620" cy="3049415"/>
+                      <a:ext cx="5849620" cy="3303155"/>
                     </a:xfrm>
                     <a:prstGeom prst="rect"/>
                   </pic:spPr>
@@ -5732,7 +5732,7 @@
           <w:b w:val="0"/>
           <w:sz w:val="20"/>
         </w:rPr>
-        <w:t>파일: evidence/2026-10-13-13-50-55.bin</w:t>
+        <w:t>파일: evidence/2026-10-13-15-25-19.bin</w:t>
         <w:br/>
         <w:t>코드: PhotoBlogServer/tools/capture_request.py</w:t>
       </w:r>
@@ -5776,7 +5776,7 @@
       <w:r>
         <w:drawing>
           <wp:inline xmlns:a="http://schemas.openxmlformats.org/drawingml/2006/main" xmlns:pic="http://schemas.openxmlformats.org/drawingml/2006/picture">
-            <wp:extent cx="5849620" cy="3053172"/>
+            <wp:extent cx="4352081" cy="4572000"/>
             <wp:docPr id="9" name="Picture 9"/>
             <wp:cNvGraphicFramePr>
               <a:graphicFrameLocks noChangeAspect="1"/>
@@ -5797,7 +5797,7 @@
                   <pic:spPr>
                     <a:xfrm>
                       <a:off x="0" y="0"/>
-                      <a:ext cx="5849620" cy="3053172"/>
+                      <a:ext cx="4352081" cy="4572000"/>
                     </a:xfrm>
                     <a:prstGeom prst="rect"/>
                   </pic:spPr>
@@ -5817,7 +5817,7 @@
           <w:b w:val="0"/>
           <w:sz w:val="18"/>
         </w:rPr>
-        <w:t>Android에서 업로드한 게시글과 초기 예제 게시글이 로컬 웹 목록에 함께 표시된다.</w:t>
+        <w:t>로컬 웹 목록 상단. API 폼과 Android에서 업로드한 두 고양이 게시글이 함께 표시된다.</w:t>
       </w:r>
     </w:p>
     <w:p>
@@ -6113,7 +6113,7 @@
       <w:r>
         <w:drawing>
           <wp:inline xmlns:a="http://schemas.openxmlformats.org/drawingml/2006/main" xmlns:pic="http://schemas.openxmlformats.org/drawingml/2006/picture">
-            <wp:extent cx="5849620" cy="3053172"/>
+            <wp:extent cx="5849620" cy="3612461"/>
             <wp:docPr id="14" name="Picture 14"/>
             <wp:cNvGraphicFramePr>
               <a:graphicFrameLocks noChangeAspect="1"/>
@@ -6134,7 +6134,7 @@
                   <pic:spPr>
                     <a:xfrm>
                       <a:off x="0" y="0"/>
-                      <a:ext cx="5849620" cy="3053172"/>
+                      <a:ext cx="5849620" cy="3612461"/>
                     </a:xfrm>
                     <a:prstGeom prst="rect"/>
                   </pic:spPr>
@@ -6167,6 +6167,18 @@
           <w:sz w:val="18"/>
         </w:rPr>
         <w:t>새 WSGI 경로와 static/media 매핑을 적용했고 DEBUG를 비활성화했다. 기존 프로젝트와 WSGI 백업은 보존했다.</w:t>
+      </w:r>
+    </w:p>
+    <w:p>
+      <w:pPr>
+        <w:spacing w:before="0" w:after="120" w:line="264" w:lineRule="auto"/>
+      </w:pPr>
+      <w:r>
+        <w:rPr>
+          <w:b w:val="0"/>
+          <w:sz w:val="20"/>
+        </w:rPr>
+        <w:t>실습 사진은 제공받은 icon_5.png와 뭐여.png 원본을 사용했다. 저장소에서는 cat_annoyed.png와 cat_what.png로 보관하고 웹과 앱에서 전체 그림이 보이도록 표시한다.</w:t>
       </w:r>
     </w:p>
     <w:p>

</xml_diff>

<commit_message>
Update audit evidence and report after server and Android fixes
</commit_message>
<xml_diff>
--- a/모바일웹서비스 프로젝트_공통평가 01_수행 결과 보고서.docx
+++ b/모바일웹서비스 프로젝트_공통평가 01_수행 결과 보고서.docx
@@ -2316,7 +2316,7 @@
               </w:rPr>
               <w:t>증빙 5</w:t>
               <w:br/>
-              <w:t>15 tests / 100%</w:t>
+              <w:t>17 tests / 100%</w:t>
             </w:r>
           </w:p>
         </w:tc>
@@ -4997,7 +4997,7 @@
       <w:r>
         <w:drawing>
           <wp:inline xmlns:a="http://schemas.openxmlformats.org/drawingml/2006/main" xmlns:pic="http://schemas.openxmlformats.org/drawingml/2006/picture">
-            <wp:extent cx="3309728" cy="3474719"/>
+            <wp:extent cx="3309728" cy="3474720"/>
             <wp:docPr id="1" name="Picture 1"/>
             <wp:cNvGraphicFramePr>
               <a:graphicFrameLocks noChangeAspect="1"/>
@@ -5018,7 +5018,7 @@
                   <pic:spPr>
                     <a:xfrm>
                       <a:off x="0" y="0"/>
-                      <a:ext cx="3309728" cy="3474719"/>
+                      <a:ext cx="3309728" cy="3474720"/>
                     </a:xfrm>
                     <a:prstGeom prst="rect"/>
                   </pic:spPr>
@@ -5050,7 +5050,7 @@
           <w:b w:val="0"/>
           <w:sz w:val="22"/>
         </w:rPr>
-        <w:t>검증 결과: 서버 15개 테스트 통과. 측정 대상 blog 실행문 98개·분기 12개 100%. Android 로컬 업로드, 클라우드 동기화, 캐시 복원, 소켓 수신 검사 통과.</w:t>
+        <w:t>검증 결과: 서버 17개 테스트 통과. 측정 대상 blog 실행문 109개·분기 14개 100%. Android 로컬 업로드, 클라우드 동기화, 캐시 복원, 소켓 수신 검사 통과.</w:t>
       </w:r>
     </w:p>
     <w:p>
@@ -5251,7 +5251,7 @@
       <w:r>
         <w:drawing>
           <wp:inline xmlns:a="http://schemas.openxmlformats.org/drawingml/2006/main" xmlns:pic="http://schemas.openxmlformats.org/drawingml/2006/picture">
-            <wp:extent cx="5849620" cy="3303155"/>
+            <wp:extent cx="5849620" cy="3303154"/>
             <wp:docPr id="4" name="Picture 4"/>
             <wp:cNvGraphicFramePr>
               <a:graphicFrameLocks noChangeAspect="1"/>
@@ -5272,7 +5272,7 @@
                   <pic:spPr>
                     <a:xfrm>
                       <a:off x="0" y="0"/>
-                      <a:ext cx="5849620" cy="3303155"/>
+                      <a:ext cx="5849620" cy="3303154"/>
                     </a:xfrm>
                     <a:prstGeom prst="rect"/>
                   </pic:spPr>
@@ -5346,7 +5346,7 @@
       <w:r>
         <w:drawing>
           <wp:inline xmlns:a="http://schemas.openxmlformats.org/drawingml/2006/main" xmlns:pic="http://schemas.openxmlformats.org/drawingml/2006/picture">
-            <wp:extent cx="5849620" cy="3049415"/>
+            <wp:extent cx="5849620" cy="3049414"/>
             <wp:docPr id="5" name="Picture 5"/>
             <wp:cNvGraphicFramePr>
               <a:graphicFrameLocks noChangeAspect="1"/>
@@ -5367,7 +5367,7 @@
                   <pic:spPr>
                     <a:xfrm>
                       <a:off x="0" y="0"/>
-                      <a:ext cx="5849620" cy="3049415"/>
+                      <a:ext cx="5849620" cy="3049414"/>
                     </a:xfrm>
                     <a:prstGeom prst="rect"/>
                   </pic:spPr>
@@ -5453,7 +5453,7 @@
       <w:r>
         <w:drawing>
           <wp:inline xmlns:a="http://schemas.openxmlformats.org/drawingml/2006/main" xmlns:pic="http://schemas.openxmlformats.org/drawingml/2006/picture">
-            <wp:extent cx="5849620" cy="3053172"/>
+            <wp:extent cx="5849620" cy="3053171"/>
             <wp:docPr id="6" name="Picture 6"/>
             <wp:cNvGraphicFramePr>
               <a:graphicFrameLocks noChangeAspect="1"/>
@@ -5474,7 +5474,7 @@
                   <pic:spPr>
                     <a:xfrm>
                       <a:off x="0" y="0"/>
-                      <a:ext cx="5849620" cy="3053172"/>
+                      <a:ext cx="5849620" cy="3053171"/>
                     </a:xfrm>
                     <a:prstGeom prst="rect"/>
                   </pic:spPr>
@@ -5536,7 +5536,7 @@
       <w:r>
         <w:drawing>
           <wp:inline xmlns:a="http://schemas.openxmlformats.org/drawingml/2006/main" xmlns:pic="http://schemas.openxmlformats.org/drawingml/2006/picture">
-            <wp:extent cx="5849620" cy="3049415"/>
+            <wp:extent cx="5849620" cy="3574767"/>
             <wp:docPr id="7" name="Picture 7"/>
             <wp:cNvGraphicFramePr>
               <a:graphicFrameLocks noChangeAspect="1"/>
@@ -5550,6 +5550,7 @@
                   </pic:nvPicPr>
                   <pic:blipFill>
                     <a:blip r:embed="rId20"/>
+                    <a:srcRect r="35714" b="15385"/>
                     <a:stretch>
                       <a:fillRect/>
                     </a:stretch>
@@ -5557,7 +5558,7 @@
                   <pic:spPr>
                     <a:xfrm>
                       <a:off x="0" y="0"/>
-                      <a:ext cx="5849620" cy="3049415"/>
+                      <a:ext cx="5849620" cy="3574767"/>
                     </a:xfrm>
                     <a:prstGeom prst="rect"/>
                   </pic:spPr>
@@ -5601,7 +5602,7 @@
           <w:b w:val="0"/>
           <w:sz w:val="22"/>
         </w:rPr>
-        <w:t>15개 테스트가 모두 통과했다. 조회·검색·404, 인증 토큰, 정상 multipart 이미지 저장, 빈 제목·누락 이미지·위조 이미지·용량·형식 오류, 다른 작성자 위조, 소유권, 수정·삭제, 웹 폼과 모델을 검사했다.</w:t>
+        <w:t>17개 테스트가 모두 통과했다. 조회·검색·404, 인증 토큰, 정상 multipart 이미지 저장, 빈 제목·누락 이미지·위조 이미지·용량·형식 오류, 다른 작성자 위조, 소유권, 수정·삭제, 웹 폼과 모델을 검사했다.</w:t>
       </w:r>
     </w:p>
     <w:p>
@@ -5613,7 +5614,7 @@
           <w:b w:val="0"/>
           <w:sz w:val="20"/>
         </w:rPr>
-        <w:t>범위: blog의 98개 실행문과 12개 분기. 테스트 코드, 마이그레이션, 초기 데이터 명령은 제외했다. Android 코드 전체의 커버리지 수치로 해석하지 않는다.</w:t>
+        <w:t>범위: blog의 109개 실행문과 14개 분기. 테스트 코드, 마이그레이션, 초기 데이터 명령은 제외했다. Android 코드 전체의 커버리지 수치로 해석하지 않는다.</w:t>
       </w:r>
     </w:p>
     <w:p>
@@ -5629,6 +5630,18 @@
       </w:r>
     </w:p>
     <w:p>
+      <w:pPr>
+        <w:spacing w:before="0" w:after="120" w:line="264" w:lineRule="auto"/>
+      </w:pPr>
+      <w:r>
+        <w:rPr>
+          <w:b w:val="0"/>
+          <w:sz w:val="20"/>
+        </w:rPr>
+        <w:t>추가 점검: Git에 포함된 소스만으로 새 DB 초기화와 migration 일치 검사를 통과했다. 웹에서도 API와 같은 5MB·이미지 형식 제한을 적용한다. Android 빌드와 Lint는 통과했으며 오류 0개, 권고 경고 18개다.</w:t>
+      </w:r>
+    </w:p>
+    <w:p>
       <w:r>
         <w:br w:type="page"/>
       </w:r>
@@ -5655,7 +5668,7 @@
       <w:r>
         <w:drawing>
           <wp:inline xmlns:a="http://schemas.openxmlformats.org/drawingml/2006/main" xmlns:pic="http://schemas.openxmlformats.org/drawingml/2006/picture">
-            <wp:extent cx="5849620" cy="3049415"/>
+            <wp:extent cx="5849620" cy="3049414"/>
             <wp:docPr id="8" name="Picture 8"/>
             <wp:cNvGraphicFramePr>
               <a:graphicFrameLocks noChangeAspect="1"/>
@@ -5676,7 +5689,7 @@
                   <pic:spPr>
                     <a:xfrm>
                       <a:off x="0" y="0"/>
-                      <a:ext cx="5849620" cy="3049415"/>
+                      <a:ext cx="5849620" cy="3049414"/>
                     </a:xfrm>
                     <a:prstGeom prst="rect"/>
                   </pic:spPr>
@@ -5776,7 +5789,7 @@
       <w:r>
         <w:drawing>
           <wp:inline xmlns:a="http://schemas.openxmlformats.org/drawingml/2006/main" xmlns:pic="http://schemas.openxmlformats.org/drawingml/2006/picture">
-            <wp:extent cx="4352081" cy="4572000"/>
+            <wp:extent cx="4352081" cy="4571999"/>
             <wp:docPr id="9" name="Picture 9"/>
             <wp:cNvGraphicFramePr>
               <a:graphicFrameLocks noChangeAspect="1"/>
@@ -5797,7 +5810,7 @@
                   <pic:spPr>
                     <a:xfrm>
                       <a:off x="0" y="0"/>
-                      <a:ext cx="4352081" cy="4572000"/>
+                      <a:ext cx="4352081" cy="4571999"/>
                     </a:xfrm>
                     <a:prstGeom prst="rect"/>
                   </pic:spPr>
@@ -6182,6 +6195,18 @@
       </w:r>
     </w:p>
     <w:p>
+      <w:pPr>
+        <w:spacing w:before="0" w:after="120" w:line="264" w:lineRule="auto"/>
+      </w:pPr>
+      <w:r>
+        <w:rPr>
+          <w:b w:val="0"/>
+          <w:sz w:val="20"/>
+        </w:rPr>
+        <w:t>2026년 10월 13일 공개 HTTPS 응답, 이미지 원본 일치, 비로그인 작성 차단과 관리자 로그인 보호를 재확인했다. 무료 사이트 유지 기한은 2026년 11월 13일이며 이후에는 Web 탭에서 갱신한다.</w:t>
+      </w:r>
+    </w:p>
+    <w:p>
       <w:r>
         <w:br w:type="page"/>
       </w:r>
@@ -6586,7 +6611,19 @@
           <w:b w:val="0"/>
           <w:sz w:val="20"/>
         </w:rPr>
-        <w:t>편의 기능 5: 제목과 본문을 임시 저장한다. 이미지 선택 URI는 현재 실행 중인 앱에서 유지하며, 앱 종료 후에는 사진을 다시 선택한다. 업로드가 완료되면 초안을 비운다.</w:t>
+        <w:t>편의 기능 5: 제목과 본문을 임시 저장한다. 사진 선택은 작성 창을 닫았다 다시 여는 동안 유지하며, 앱 종료나 화면 재생성 후에는 다시 선택한다. 업로드가 완료되면 초안을 비운다.</w:t>
+      </w:r>
+    </w:p>
+    <w:p>
+      <w:pPr>
+        <w:spacing w:before="0" w:after="120" w:line="264" w:lineRule="auto"/>
+      </w:pPr>
+      <w:r>
+        <w:rPr>
+          <w:b w:val="0"/>
+          <w:sz w:val="20"/>
+        </w:rPr>
+        <w:t>추가 기기 검사에서 화면 재생성 후 제목·본문 복원과 지연된 업로드 응답 도착 시 앱 유지도 통과했다. 서버별 토큰 분리와 삭제를 함께 확인했다. 테스트: EvidenceRunner의 audit 모드.</w:t>
       </w:r>
     </w:p>
     <w:sectPr>

</xml_diff>

<commit_message>
Complete API screenshot evidence with browser address bars
</commit_message>
<xml_diff>
--- a/모바일웹서비스 프로젝트_공통평가 01_수행 결과 보고서.docx
+++ b/모바일웹서비스 프로젝트_공통평가 01_수행 결과 보고서.docx
@@ -1497,7 +1497,7 @@
               <w:rPr>
                 <w:sz w:val="14"/>
               </w:rPr>
-              <w:t>보완</w:t>
+              <w:t>○</w:t>
             </w:r>
           </w:p>
         </w:tc>
@@ -1539,7 +1539,7 @@
               <w:br/>
               <w:t>입력·201·게시</w:t>
               <w:br/>
-              <w:t>주소 창 보완 필요</w:t>
+              <w:t>주소 창 포함</w:t>
             </w:r>
           </w:p>
         </w:tc>
@@ -4997,7 +4997,7 @@
       <w:r>
         <w:drawing>
           <wp:inline xmlns:a="http://schemas.openxmlformats.org/drawingml/2006/main" xmlns:pic="http://schemas.openxmlformats.org/drawingml/2006/picture">
-            <wp:extent cx="3309728" cy="3474720"/>
+            <wp:extent cx="5849620" cy="3207667"/>
             <wp:docPr id="1" name="Picture 1"/>
             <wp:cNvGraphicFramePr>
               <a:graphicFrameLocks noChangeAspect="1"/>
@@ -5011,6 +5011,7 @@
                   </pic:nvPicPr>
                   <pic:blipFill>
                     <a:blip r:embed="rId14"/>
+                    <a:srcRect b="47768"/>
                     <a:stretch>
                       <a:fillRect/>
                     </a:stretch>
@@ -5018,7 +5019,7 @@
                   <pic:spPr>
                     <a:xfrm>
                       <a:off x="0" y="0"/>
-                      <a:ext cx="3309728" cy="3474720"/>
+                      <a:ext cx="5849620" cy="3207667"/>
                     </a:xfrm>
                     <a:prstGeom prst="rect"/>
                   </pic:spPr>
@@ -5062,7 +5063,7 @@
           <w:b w:val="0"/>
           <w:sz w:val="20"/>
         </w:rPr>
-        <w:t>보완 사항: 브라우저 본문 캡처에는 주소 표시줄이 포함되지 않는다. ID 3은 입력·201 응답·게시 완료가 검증되었으나, 양식이 요구한 주소 표시줄 포함 캡처로 교체한 뒤 최종 제출한다.</w:t>
+        <w:t>ID 3의 입력 폼과 게시 완료 화면은 주소 표시줄이 포함된 실제 캡처로 수록했다. 생성 시 저장한 HTTP 201 응답과 게시글 ID 5의 상세 화면을 함께 제시한다.</w:t>
       </w:r>
     </w:p>
     <w:p>
@@ -5104,7 +5105,7 @@
       <w:r>
         <w:drawing>
           <wp:inline xmlns:a="http://schemas.openxmlformats.org/drawingml/2006/main" xmlns:pic="http://schemas.openxmlformats.org/drawingml/2006/picture">
-            <wp:extent cx="5016644" cy="2834640"/>
+            <wp:extent cx="5410393" cy="2834640"/>
             <wp:docPr id="2" name="Picture 2"/>
             <wp:cNvGraphicFramePr>
               <a:graphicFrameLocks noChangeAspect="1"/>
@@ -5113,7 +5114,7 @@
               <a:graphicData uri="http://schemas.openxmlformats.org/drawingml/2006/picture">
                 <pic:pic>
                   <pic:nvPicPr>
-                    <pic:cNvPr id="0" name="api-form.jpg"/>
+                    <pic:cNvPr id="0" name="api-form-address-bar.png"/>
                     <pic:cNvPicPr/>
                   </pic:nvPicPr>
                   <pic:blipFill>
@@ -5125,7 +5126,7 @@
                   <pic:spPr>
                     <a:xfrm>
                       <a:off x="0" y="0"/>
-                      <a:ext cx="5016644" cy="2834640"/>
+                      <a:ext cx="5410393" cy="2834640"/>
                     </a:xfrm>
                     <a:prstGeom prst="rect"/>
                   </pic:spPr>
@@ -5145,7 +5146,7 @@
           <w:b w:val="0"/>
           <w:sz w:val="18"/>
         </w:rPr>
-        <w:t>사진 cat_annoyed.png와 제목·본문을 입력한 REST framework HTML form.</w:t>
+        <w:t>주소 표시줄과 제목·본문·cat_annoyed.png 선택 상태가 보이는 API 입력 폼.</w:t>
       </w:r>
     </w:p>
     <w:p>
@@ -5209,7 +5210,7 @@
           <w:b w:val="0"/>
           <w:sz w:val="20"/>
         </w:rPr>
-        <w:t>아래 페이지의 웹 상세 화면에서도 동일한 글과 이미지를 확인했다. 주소 표시줄 포함 캡처는 보완 대상이다.</w:t>
+        <w:t>입력 폼 캡처는 동일한 제목·본문·사진으로 재확인한 화면이며, HTTP 201 응답은 실제 게시글 생성 시 저장했다. 다음 페이지에서 게시글 ID 5와 이미지를 확인한다.</w:t>
       </w:r>
     </w:p>
     <w:p>
@@ -5251,7 +5252,7 @@
       <w:r>
         <w:drawing>
           <wp:inline xmlns:a="http://schemas.openxmlformats.org/drawingml/2006/main" xmlns:pic="http://schemas.openxmlformats.org/drawingml/2006/picture">
-            <wp:extent cx="5849620" cy="3303154"/>
+            <wp:extent cx="5849620" cy="3202448"/>
             <wp:docPr id="4" name="Picture 4"/>
             <wp:cNvGraphicFramePr>
               <a:graphicFrameLocks noChangeAspect="1"/>
@@ -5260,7 +5261,7 @@
               <a:graphicData uri="http://schemas.openxmlformats.org/drawingml/2006/picture">
                 <pic:pic>
                   <pic:nvPicPr>
-                    <pic:cNvPr id="0" name="api-post-detail.jpg"/>
+                    <pic:cNvPr id="0" name="api-post-detail-address-bar.png"/>
                     <pic:cNvPicPr/>
                   </pic:nvPicPr>
                   <pic:blipFill>
@@ -5272,7 +5273,7 @@
                   <pic:spPr>
                     <a:xfrm>
                       <a:off x="0" y="0"/>
-                      <a:ext cx="5849620" cy="3303154"/>
+                      <a:ext cx="5849620" cy="3202448"/>
                     </a:xfrm>
                     <a:prstGeom prst="rect"/>
                   </pic:spPr>
@@ -5292,7 +5293,7 @@
           <w:b w:val="0"/>
           <w:sz w:val="18"/>
         </w:rPr>
-        <w:t>API에서 생성한 글의 제목, 게시글 ID와 이미지가 웹 상세 페이지에 표시된다.</w:t>
+        <w:t>주소 표시줄의 /post/5/와 게시 완료 표시, 제목 및 고양이 이미지를 확인했다.</w:t>
       </w:r>
     </w:p>
     <w:p>

</xml_diff>

<commit_message>
Keep assessment report to original form and screenshot evidence
</commit_message>
<xml_diff>
--- a/모바일웹서비스 프로젝트_공통평가 01_수행 결과 보고서.docx
+++ b/모바일웹서비스 프로젝트_공통평가 01_수행 결과 보고서.docx
@@ -952,8 +952,6 @@
                 <w:sz w:val="14"/>
               </w:rPr>
               <w:t>증빙 1</w:t>
-              <w:br/>
-              <w:t>폴더 구조</w:t>
             </w:r>
           </w:p>
         </w:tc>
@@ -1164,9 +1162,7 @@
               <w:rPr>
                 <w:sz w:val="14"/>
               </w:rPr>
-              <w:t>증빙 1</w:t>
-              <w:br/>
-              <w:t>GitHub URL</w:t>
+              <w:t>https://github.com/AspirantEstelle/photoblog-evaluation01</w:t>
             </w:r>
           </w:p>
         </w:tc>
@@ -1536,10 +1532,6 @@
                 <w:sz w:val="14"/>
               </w:rPr>
               <w:t>증빙 2</w:t>
-              <w:br/>
-              <w:t>입력·201·게시</w:t>
-              <w:br/>
-              <w:t>주소 창 포함</w:t>
             </w:r>
           </w:p>
         </w:tc>
@@ -1760,8 +1752,6 @@
                 <w:sz w:val="14"/>
               </w:rPr>
               <w:t>증빙 3</w:t>
-              <w:br/>
-              <w:t>콘솔 HTTP 200</w:t>
             </w:r>
           </w:p>
         </w:tc>
@@ -1999,8 +1989,6 @@
                 <w:sz w:val="14"/>
               </w:rPr>
               <w:t>증빙 4</w:t>
-              <w:br/>
-              <w:t>JSON 트리</w:t>
             </w:r>
           </w:p>
         </w:tc>
@@ -2315,8 +2303,6 @@
                 <w:sz w:val="14"/>
               </w:rPr>
               <w:t>증빙 5</w:t>
-              <w:br/>
-              <w:t>17 tests / 100%</w:t>
             </w:r>
           </w:p>
         </w:tc>
@@ -2588,8 +2574,6 @@
                 <w:sz w:val="14"/>
               </w:rPr>
               <w:t>증빙 6</w:t>
-              <w:br/>
-              <w:t>Android GET 원문</w:t>
             </w:r>
           </w:p>
         </w:tc>
@@ -2839,8 +2823,6 @@
                 <w:sz w:val="14"/>
               </w:rPr>
               <w:t>증빙 7</w:t>
-              <w:br/>
-              <w:t>로컬 브라우저</w:t>
             </w:r>
           </w:p>
         </w:tc>
@@ -3066,9 +3048,7 @@
               <w:rPr>
                 <w:sz w:val="14"/>
               </w:rPr>
-              <w:t>증빙 8</w:t>
-              <w:br/>
-              <w:t>첫 실행</w:t>
+              <w:t>증빙 8 왼쪽</w:t>
             </w:r>
           </w:p>
         </w:tc>
@@ -3317,9 +3297,7 @@
               <w:rPr>
                 <w:sz w:val="14"/>
               </w:rPr>
-              <w:t>증빙 8</w:t>
-              <w:br/>
-              <w:t>동기화 완료</w:t>
+              <w:t>증빙 8 오른쪽</w:t>
             </w:r>
           </w:p>
         </w:tc>
@@ -3769,8 +3747,6 @@
                 <w:sz w:val="14"/>
               </w:rPr>
               <w:t>증빙 9</w:t>
-              <w:br/>
-              <w:t>입력 UI 업로드</w:t>
             </w:r>
           </w:p>
         </w:tc>
@@ -3979,9 +3955,7 @@
               <w:rPr>
                 <w:sz w:val="14"/>
               </w:rPr>
-              <w:t>증빙 10</w:t>
-              <w:br/>
-              <w:t>HTTPS 서버</w:t>
+              <w:t>증빙 10 서버</w:t>
             </w:r>
           </w:p>
         </w:tc>
@@ -4190,9 +4164,7 @@
               <w:rPr>
                 <w:sz w:val="14"/>
               </w:rPr>
-              <w:t>증빙 10</w:t>
-              <w:br/>
-              <w:t>클라우드 동기화</w:t>
+              <w:t>증빙 10 클라이언트</w:t>
             </w:r>
           </w:p>
         </w:tc>
@@ -4254,10 +4226,10 @@
             <w:r>
               <w:rPr>
                 <w:rFonts w:hint="eastAsia"/>
-                <w:sz w:val="14"/>
+                <w:sz w:val="12"/>
                 <w:szCs w:val="12"/>
               </w:rPr>
-              <w:t>연결 설정 저장</w:t>
+              <w:t>기타 기획 되지 않은 Client  편의 기능 [최대 5개]</w:t>
             </w:r>
           </w:p>
         </w:tc>
@@ -4275,10 +4247,37 @@
             <w:r>
               <w:rPr>
                 <w:rFonts w:hint="eastAsia"/>
-                <w:sz w:val="14"/>
+                <w:sz w:val="12"/>
                 <w:szCs w:val="12"/>
               </w:rPr>
-              <w:t>로컬/클라우드 프리셋, 서버별 토큰 분리 및 설정 저장.</w:t>
+              <w:t>제출 : 해당 기능 정의, 설명 및 동작 증빙 화면 캡처</w:t>
+            </w:r>
+          </w:p>
+          <w:p>
+            <w:pPr>
+              <w:rPr>
+                <w:sz w:val="12"/>
+                <w:szCs w:val="12"/>
+              </w:rPr>
+            </w:pPr>
+            <w:r>
+              <w:rPr>
+                <w:rFonts w:hint="eastAsia"/>
+                <w:sz w:val="12"/>
+                <w:szCs w:val="12"/>
+              </w:rPr>
+              <w:t>(서버/클라이언트 각각 구현이 필요한 경우 별도 요구사항으로 등록 함)</w:t>
+            </w:r>
+          </w:p>
+          <w:p>
+            <w:pPr>
+              <w:spacing w:before="80" w:after="0"/>
+            </w:pPr>
+            <w:r>
+              <w:rPr>
+                <w:sz w:val="14"/>
+              </w:rPr>
+              <w:t>1. 연결 설정 저장: 로컬·클라우드 주소와 서버별 인증 토큰을 저장한다.</w:t>
             </w:r>
           </w:p>
         </w:tc>
@@ -4337,9 +4336,7 @@
               <w:rPr>
                 <w:sz w:val="14"/>
               </w:rPr>
-              <w:t>증빙 11</w:t>
-              <w:br/>
-              <w:t>연결 설정</w:t>
+              <w:t>증빙 11 왼쪽</w:t>
             </w:r>
           </w:p>
         </w:tc>
@@ -4419,7 +4416,7 @@
               <w:rPr>
                 <w:sz w:val="14"/>
               </w:rPr>
-              <w:t>내려받은 게시글 제목과 본문을 입력 즉시 검색.</w:t>
+              <w:t>입력한 검색어로 내려받은 게시글을 필터링한다.</w:t>
             </w:r>
           </w:p>
         </w:tc>
@@ -4478,9 +4475,7 @@
               <w:rPr>
                 <w:sz w:val="14"/>
               </w:rPr>
-              <w:t>증빙 11</w:t>
-              <w:br/>
-              <w:t>검색</w:t>
+              <w:t>증빙 11 오른쪽</w:t>
             </w:r>
           </w:p>
         </w:tc>
@@ -4560,7 +4555,7 @@
               <w:rPr>
                 <w:sz w:val="14"/>
               </w:rPr>
-              <w:t>항목 선택 시 큰 사진, 본문, 작성자와 게시글 ID 표시.</w:t>
+              <w:t>선택한 사진의 확대 화면, 본문, 작성자를 표시한다.</w:t>
             </w:r>
           </w:p>
         </w:tc>
@@ -4619,9 +4614,7 @@
               <w:rPr>
                 <w:sz w:val="14"/>
               </w:rPr>
-              <w:t>증빙 12</w:t>
-              <w:br/>
-              <w:t>상세 보기</w:t>
+              <w:t>증빙 12 왼쪽</w:t>
             </w:r>
           </w:p>
         </w:tc>
@@ -4701,7 +4694,7 @@
               <w:rPr>
                 <w:sz w:val="14"/>
               </w:rPr>
-              <w:t>서버별 목록과 이미지 캐시. 앱 재실행 시 기존 목록 복원.</w:t>
+              <w:t>앱 재실행 시 저장된 목록과 이미지 캐시를 표시한다.</w:t>
             </w:r>
           </w:p>
         </w:tc>
@@ -4760,9 +4753,7 @@
               <w:rPr>
                 <w:sz w:val="14"/>
               </w:rPr>
-              <w:t>증빙 12</w:t>
-              <w:br/>
-              <w:t>캐시 복원</w:t>
+              <w:t>증빙 12 오른쪽</w:t>
             </w:r>
           </w:p>
         </w:tc>
@@ -4842,7 +4833,7 @@
               <w:rPr>
                 <w:sz w:val="14"/>
               </w:rPr>
-              <w:t>입력 창을 닫았다 다시 열면 제목과 본문 복원.</w:t>
+              <w:t>작성 창을 다시 열면 입력 중이던 제목과 본문을 복원한다.</w:t>
             </w:r>
           </w:p>
         </w:tc>
@@ -4902,8 +4893,6 @@
                 <w:sz w:val="14"/>
               </w:rPr>
               <w:t>증빙 13</w:t>
-              <w:br/>
-              <w:t>초안 복원</w:t>
             </w:r>
           </w:p>
         </w:tc>
@@ -4931,68 +4920,20 @@
       <w:pPr>
         <w:pStyle w:val="aff8"/>
         <w:keepNext/>
-        <w:spacing w:after="240"/>
+        <w:spacing w:before="0" w:after="240"/>
       </w:pPr>
       <w:r>
         <w:rPr>
           <w:b/>
           <w:sz w:val="28"/>
         </w:rPr>
-        <w:t>증빙 1 제출 구성과 실행 결과</w:t>
+        <w:t>증빙 1 폴더 구조</w:t>
       </w:r>
     </w:p>
     <w:p>
       <w:pPr>
-        <w:spacing w:before="0" w:after="120" w:line="264" w:lineRule="auto"/>
-      </w:pPr>
-      <w:r>
-        <w:rPr>
-          <w:b w:val="0"/>
-          <w:sz w:val="22"/>
-        </w:rPr>
-        <w:t>2022105748 조연흠 · 검증일 2026년 10월 13일</w:t>
-      </w:r>
-    </w:p>
-    <w:p>
-      <w:pPr>
-        <w:spacing w:before="0" w:after="120" w:line="264" w:lineRule="auto"/>
-      </w:pPr>
-      <w:r>
-        <w:rPr>
-          <w:b w:val="0"/>
-          <w:sz w:val="22"/>
-        </w:rPr>
-        <w:t>Django 포토 블로그 API와 Android PhotoViewer를 구현했다. 로컬 사진 업로드, 클라우드 동기화, 서버 자동 테스트를 실행했다. 필수 폴더와 전체 소스, 이 보고서 및 실제 실행 증빙을 신규 저장소에 포함했다.</w:t>
-      </w:r>
-    </w:p>
-    <w:p>
-      <w:pPr>
-        <w:spacing w:before="0" w:after="120" w:line="264" w:lineRule="auto"/>
-      </w:pPr>
-      <w:r>
-        <w:rPr>
-          <w:b w:val="0"/>
-          <w:sz w:val="20"/>
-        </w:rPr>
-        <w:t>GitHub: https://github.com/AspirantEstelle/photoblog-evaluation01</w:t>
-      </w:r>
-    </w:p>
-    <w:p>
-      <w:pPr>
-        <w:spacing w:before="0" w:after="120" w:line="264" w:lineRule="auto"/>
-      </w:pPr>
-      <w:r>
-        <w:rPr>
-          <w:b w:val="0"/>
-          <w:sz w:val="20"/>
-        </w:rPr>
-        <w:t>서비스: https://gyusik.pythonanywhere.com/</w:t>
-      </w:r>
-    </w:p>
-    <w:p>
-      <w:pPr>
-        <w:keepNext/>
-        <w:spacing w:after="80"/>
+        <w:keepNext w:val="0"/>
+        <w:spacing w:before="0" w:after="240"/>
       </w:pPr>
       <w:r>
         <w:drawing>
@@ -5031,42 +4972,6 @@
       </w:r>
     </w:p>
     <w:p>
-      <w:pPr>
-        <w:spacing w:before="0" w:after="120" w:line="264" w:lineRule="auto"/>
-      </w:pPr>
-      <w:r>
-        <w:rPr>
-          <w:b w:val="0"/>
-          <w:sz w:val="18"/>
-        </w:rPr>
-        <w:t>저장소 루트. PhotoBlogServer, PhotoViewer, 수행 결과 보고서와 evidence 폴더를 포함한다.</w:t>
-      </w:r>
-    </w:p>
-    <w:p>
-      <w:pPr>
-        <w:spacing w:before="0" w:after="120" w:line="264" w:lineRule="auto"/>
-      </w:pPr>
-      <w:r>
-        <w:rPr>
-          <w:b w:val="0"/>
-          <w:sz w:val="22"/>
-        </w:rPr>
-        <w:t>검증 결과: 서버 17개 테스트 통과. 측정 대상 blog 실행문 109개·분기 14개 100%. Android 로컬 업로드, 클라우드 동기화, 캐시 복원, 소켓 수신 검사 통과.</w:t>
-      </w:r>
-    </w:p>
-    <w:p>
-      <w:pPr>
-        <w:spacing w:before="0" w:after="120" w:line="264" w:lineRule="auto"/>
-      </w:pPr>
-      <w:r>
-        <w:rPr>
-          <w:b w:val="0"/>
-          <w:sz w:val="20"/>
-        </w:rPr>
-        <w:t>ID 3의 입력 폼과 게시 완료 화면은 주소 표시줄이 포함된 실제 캡처로 수록했다. 생성 시 저장한 HTTP 201 응답과 게시글 ID 5의 상세 화면을 함께 제시한다.</w:t>
-      </w:r>
-    </w:p>
-    <w:p>
       <w:r>
         <w:br w:type="page"/>
       </w:r>
@@ -5075,37 +4980,25 @@
       <w:pPr>
         <w:pStyle w:val="aff8"/>
         <w:keepNext/>
-        <w:spacing w:after="240"/>
+        <w:spacing w:before="0" w:after="240"/>
       </w:pPr>
       <w:r>
         <w:rPr>
           <w:b/>
           <w:sz w:val="28"/>
         </w:rPr>
-        <w:t>증빙 2 API 게시글 생성</w:t>
+        <w:t>증빙 2 API 입력 및 생성 응답</w:t>
       </w:r>
     </w:p>
     <w:p>
       <w:pPr>
-        <w:spacing w:before="0" w:after="120" w:line="264" w:lineRule="auto"/>
-      </w:pPr>
-      <w:r>
-        <w:rPr>
-          <w:b w:val="0"/>
-          <w:sz w:val="20"/>
-        </w:rPr>
-        <w:t>POST http://127.0.0.1:8000/api_root/Post/ · 로그인한 작성자로 제목·본문·이미지를 전송했다.</w:t>
-      </w:r>
-    </w:p>
-    <w:p>
-      <w:pPr>
-        <w:keepNext/>
-        <w:spacing w:after="80"/>
+        <w:keepNext w:val="0"/>
+        <w:spacing w:before="0" w:after="240"/>
       </w:pPr>
       <w:r>
         <w:drawing>
           <wp:inline xmlns:a="http://schemas.openxmlformats.org/drawingml/2006/main" xmlns:pic="http://schemas.openxmlformats.org/drawingml/2006/picture">
-            <wp:extent cx="5410393" cy="2834640"/>
+            <wp:extent cx="5759451" cy="3017519"/>
             <wp:docPr id="2" name="Picture 2"/>
             <wp:cNvGraphicFramePr>
               <a:graphicFrameLocks noChangeAspect="1"/>
@@ -5126,7 +5019,7 @@
                   <pic:spPr>
                     <a:xfrm>
                       <a:off x="0" y="0"/>
-                      <a:ext cx="5410393" cy="2834640"/>
+                      <a:ext cx="5759451" cy="3017519"/>
                     </a:xfrm>
                     <a:prstGeom prst="rect"/>
                   </pic:spPr>
@@ -5139,25 +5032,13 @@
     </w:p>
     <w:p>
       <w:pPr>
-        <w:spacing w:before="0" w:after="120" w:line="264" w:lineRule="auto"/>
-      </w:pPr>
-      <w:r>
-        <w:rPr>
-          <w:b w:val="0"/>
-          <w:sz w:val="18"/>
-        </w:rPr>
-        <w:t>주소 표시줄과 제목·본문·cat_annoyed.png 선택 상태가 보이는 API 입력 폼.</w:t>
-      </w:r>
-    </w:p>
-    <w:p>
-      <w:pPr>
-        <w:keepNext/>
-        <w:spacing w:after="80"/>
+        <w:keepNext w:val="0"/>
+        <w:spacing w:before="0" w:after="240"/>
       </w:pPr>
       <w:r>
         <w:drawing>
           <wp:inline xmlns:a="http://schemas.openxmlformats.org/drawingml/2006/main" xmlns:pic="http://schemas.openxmlformats.org/drawingml/2006/picture">
-            <wp:extent cx="5016644" cy="2834640"/>
+            <wp:extent cx="5340298" cy="3017520"/>
             <wp:docPr id="3" name="Picture 3"/>
             <wp:cNvGraphicFramePr>
               <a:graphicFrameLocks noChangeAspect="1"/>
@@ -5178,7 +5059,7 @@
                   <pic:spPr>
                     <a:xfrm>
                       <a:off x="0" y="0"/>
-                      <a:ext cx="5016644" cy="2834640"/>
+                      <a:ext cx="5340298" cy="3017520"/>
                     </a:xfrm>
                     <a:prstGeom prst="rect"/>
                   </pic:spPr>
@@ -5190,30 +5071,6 @@
       </w:r>
     </w:p>
     <w:p>
-      <w:pPr>
-        <w:spacing w:before="0" w:after="120" w:line="264" w:lineRule="auto"/>
-      </w:pPr>
-      <w:r>
-        <w:rPr>
-          <w:b w:val="0"/>
-          <w:sz w:val="18"/>
-        </w:rPr>
-        <w:t>HTTP 201 Created, 게시글 ID 5와 업로드 이미지 URL이 반환되었다.</w:t>
-      </w:r>
-    </w:p>
-    <w:p>
-      <w:pPr>
-        <w:spacing w:before="0" w:after="120" w:line="264" w:lineRule="auto"/>
-      </w:pPr>
-      <w:r>
-        <w:rPr>
-          <w:b w:val="0"/>
-          <w:sz w:val="20"/>
-        </w:rPr>
-        <w:t>입력 폼 캡처는 동일한 제목·본문·사진으로 재확인한 화면이며, HTTP 201 응답은 실제 게시글 생성 시 저장했다. 다음 페이지에서 게시글 ID 5와 이미지를 확인한다.</w:t>
-      </w:r>
-    </w:p>
-    <w:p>
       <w:r>
         <w:br w:type="page"/>
       </w:r>
@@ -5222,7 +5079,7 @@
       <w:pPr>
         <w:pStyle w:val="aff8"/>
         <w:keepNext/>
-        <w:spacing w:after="240"/>
+        <w:spacing w:before="0" w:after="240"/>
       </w:pPr>
       <w:r>
         <w:rPr>
@@ -5234,20 +5091,8 @@
     </w:p>
     <w:p>
       <w:pPr>
-        <w:spacing w:before="0" w:after="120" w:line="264" w:lineRule="auto"/>
-      </w:pPr>
-      <w:r>
-        <w:rPr>
-          <w:b w:val="0"/>
-          <w:sz w:val="20"/>
-        </w:rPr>
-        <w:t>게시글 URL: http://127.0.0.1:8000/post/5/</w:t>
-      </w:r>
-    </w:p>
-    <w:p>
-      <w:pPr>
-        <w:keepNext/>
-        <w:spacing w:after="80"/>
+        <w:keepNext w:val="0"/>
+        <w:spacing w:before="0" w:after="240"/>
       </w:pPr>
       <w:r>
         <w:drawing>
@@ -5285,30 +5130,6 @@
       </w:r>
     </w:p>
     <w:p>
-      <w:pPr>
-        <w:spacing w:before="0" w:after="120" w:line="264" w:lineRule="auto"/>
-      </w:pPr>
-      <w:r>
-        <w:rPr>
-          <w:b w:val="0"/>
-          <w:sz w:val="18"/>
-        </w:rPr>
-        <w:t>주소 표시줄의 /post/5/와 게시 완료 표시, 제목 및 고양이 이미지를 확인했다.</w:t>
-      </w:r>
-    </w:p>
-    <w:p>
-      <w:pPr>
-        <w:spacing w:before="0" w:after="120" w:line="264" w:lineRule="auto"/>
-      </w:pPr>
-      <w:r>
-        <w:rPr>
-          <w:b w:val="0"/>
-          <w:sz w:val="22"/>
-        </w:rPr>
-        <w:t>요청의 multipart image 필드를 ImageField로 저장하며 author는 인증된 사용자로 설정한다. 생성·수정 웹 폼은 request.FILES와 multipart/form-data를 사용한다.</w:t>
-      </w:r>
-    </w:p>
-    <w:p>
       <w:r>
         <w:br w:type="page"/>
       </w:r>
@@ -5317,32 +5138,20 @@
       <w:pPr>
         <w:pStyle w:val="aff8"/>
         <w:keepNext/>
-        <w:spacing w:after="240"/>
+        <w:spacing w:before="0" w:after="240"/>
       </w:pPr>
       <w:r>
         <w:rPr>
           <w:b/>
           <w:sz w:val="28"/>
         </w:rPr>
-        <w:t>증빙 3 API 콘솔 검증</w:t>
+        <w:t>증빙 3 API 터미널 검증</w:t>
       </w:r>
     </w:p>
     <w:p>
       <w:pPr>
-        <w:spacing w:before="0" w:after="120" w:line="264" w:lineRule="auto"/>
-      </w:pPr>
-      <w:r>
-        <w:rPr>
-          <w:b w:val="0"/>
-          <w:sz w:val="22"/>
-        </w:rPr>
-        <w:t>PythonAnywhere Bash 콘솔에서 tools/verify_api.py로 배포 API를 실제 호출했다.</w:t>
-      </w:r>
-    </w:p>
-    <w:p>
-      <w:pPr>
-        <w:keepNext/>
-        <w:spacing w:after="80"/>
+        <w:keepNext w:val="0"/>
+        <w:spacing w:before="0" w:after="240"/>
       </w:pPr>
       <w:r>
         <w:drawing>
@@ -5380,42 +5189,6 @@
       </w:r>
     </w:p>
     <w:p>
-      <w:pPr>
-        <w:spacing w:before="0" w:after="120" w:line="264" w:lineRule="auto"/>
-      </w:pPr>
-      <w:r>
-        <w:rPr>
-          <w:b w:val="0"/>
-          <w:sz w:val="18"/>
-        </w:rPr>
-        <w:t>GET → HTTP 200 → application/json → JSON 배열과 필수 필드 검증 성공.</w:t>
-      </w:r>
-    </w:p>
-    <w:p>
-      <w:pPr>
-        <w:spacing w:before="0" w:after="120" w:line="264" w:lineRule="auto"/>
-      </w:pPr>
-      <w:r>
-        <w:rPr>
-          <w:b w:val="0"/>
-          <w:sz w:val="20"/>
-        </w:rPr>
-        <w:t>요청: https://gyusik.pythonanywhere.com/api_root/Post/</w:t>
-      </w:r>
-    </w:p>
-    <w:p>
-      <w:pPr>
-        <w:spacing w:before="0" w:after="120" w:line="264" w:lineRule="auto"/>
-      </w:pPr>
-      <w:r>
-        <w:rPr>
-          <w:b w:val="0"/>
-          <w:sz w:val="22"/>
-        </w:rPr>
-        <w:t>검사 코드와 API 원문 JSON을 저장소에 함께 포함했다. 여기서 사용한 예제 게시글과 이미지 URL은 공개 실습 데이터다.</w:t>
-      </w:r>
-    </w:p>
-    <w:p>
       <w:r>
         <w:br w:type="page"/>
       </w:r>
@@ -5424,7 +5197,7 @@
       <w:pPr>
         <w:pStyle w:val="aff8"/>
         <w:keepNext/>
-        <w:spacing w:after="240"/>
+        <w:spacing w:before="0" w:after="240"/>
       </w:pPr>
       <w:r>
         <w:rPr>
@@ -5436,20 +5209,8 @@
     </w:p>
     <w:p>
       <w:pPr>
-        <w:spacing w:before="0" w:after="120" w:line="264" w:lineRule="auto"/>
-      </w:pPr>
-      <w:r>
-        <w:rPr>
-          <w:b w:val="0"/>
-          <w:sz w:val="20"/>
-        </w:rPr>
-        <w:t>https://codebeautify.org/jsonviewer 에 실제 API 응답을 붙여 넣어 트리 형태로 확인했다.</w:t>
-      </w:r>
-    </w:p>
-    <w:p>
-      <w:pPr>
-        <w:keepNext/>
-        <w:spacing w:after="80"/>
+        <w:keepNext w:val="0"/>
+        <w:spacing w:before="0" w:after="240"/>
       </w:pPr>
       <w:r>
         <w:drawing>
@@ -5487,30 +5248,6 @@
       </w:r>
     </w:p>
     <w:p>
-      <w:pPr>
-        <w:spacing w:before="0" w:after="120" w:line="264" w:lineRule="auto"/>
-      </w:pPr>
-      <w:r>
-        <w:rPr>
-          <w:b w:val="0"/>
-          <w:sz w:val="18"/>
-        </w:rPr>
-        <w:t>최상위 array와 id, author, title, text, 날짜, image URL을 확인했다.</w:t>
-      </w:r>
-    </w:p>
-    <w:p>
-      <w:pPr>
-        <w:spacing w:before="0" w:after="120" w:line="264" w:lineRule="auto"/>
-      </w:pPr>
-      <w:r>
-        <w:rPr>
-          <w:b w:val="0"/>
-          <w:sz w:val="22"/>
-        </w:rPr>
-        <w:t>원본: evidence/api-response.json. JSON 배열의 각 원소는 게시글 객체이며, Android는 image의 절대 URL로 이미지를 내려받는다.</w:t>
-      </w:r>
-    </w:p>
-    <w:p>
       <w:r>
         <w:br w:type="page"/>
       </w:r>
@@ -5519,20 +5256,20 @@
       <w:pPr>
         <w:pStyle w:val="aff8"/>
         <w:keepNext/>
-        <w:spacing w:after="240"/>
+        <w:spacing w:before="0" w:after="240"/>
       </w:pPr>
       <w:r>
         <w:rPr>
           <w:b/>
           <w:sz w:val="28"/>
         </w:rPr>
-        <w:t>증빙 5 서버 자동 테스트와 커버리지</w:t>
+        <w:t>증빙 5 Code Coverage</w:t>
       </w:r>
     </w:p>
     <w:p>
       <w:pPr>
-        <w:keepNext/>
-        <w:spacing w:after="80"/>
+        <w:keepNext w:val="0"/>
+        <w:spacing w:before="0" w:after="240"/>
       </w:pPr>
       <w:r>
         <w:drawing>
@@ -5571,78 +5308,6 @@
       </w:r>
     </w:p>
     <w:p>
-      <w:pPr>
-        <w:spacing w:before="0" w:after="120" w:line="264" w:lineRule="auto"/>
-      </w:pPr>
-      <w:r>
-        <w:rPr>
-          <w:b w:val="0"/>
-          <w:sz w:val="18"/>
-        </w:rPr>
-        <w:t>coverage.py HTML 보고서: 지정한 blog 코드의 실행문과 분기 모두 100%.</w:t>
-      </w:r>
-    </w:p>
-    <w:p>
-      <w:pPr>
-        <w:spacing w:before="0" w:after="120" w:line="264" w:lineRule="auto"/>
-      </w:pPr>
-      <w:r>
-        <w:rPr>
-          <w:b w:val="0"/>
-          <w:sz w:val="20"/>
-        </w:rPr>
-        <w:t>실행: python -m coverage run manage.py test blog -v 2</w:t>
-      </w:r>
-    </w:p>
-    <w:p>
-      <w:pPr>
-        <w:spacing w:before="0" w:after="120" w:line="264" w:lineRule="auto"/>
-      </w:pPr>
-      <w:r>
-        <w:rPr>
-          <w:b w:val="0"/>
-          <w:sz w:val="22"/>
-        </w:rPr>
-        <w:t>17개 테스트가 모두 통과했다. 조회·검색·404, 인증 토큰, 정상 multipart 이미지 저장, 빈 제목·누락 이미지·위조 이미지·용량·형식 오류, 다른 작성자 위조, 소유권, 수정·삭제, 웹 폼과 모델을 검사했다.</w:t>
-      </w:r>
-    </w:p>
-    <w:p>
-      <w:pPr>
-        <w:spacing w:before="0" w:after="120" w:line="264" w:lineRule="auto"/>
-      </w:pPr>
-      <w:r>
-        <w:rPr>
-          <w:b w:val="0"/>
-          <w:sz w:val="20"/>
-        </w:rPr>
-        <w:t>범위: blog의 109개 실행문과 14개 분기. 테스트 코드, 마이그레이션, 초기 데이터 명령은 제외했다. Android 코드 전체의 커버리지 수치로 해석하지 않는다.</w:t>
-      </w:r>
-    </w:p>
-    <w:p>
-      <w:pPr>
-        <w:spacing w:before="0" w:after="120" w:line="264" w:lineRule="auto"/>
-      </w:pPr>
-      <w:r>
-        <w:rPr>
-          <w:b w:val="0"/>
-          <w:sz w:val="20"/>
-        </w:rPr>
-        <w:t>소스: PhotoBlogServer/blog/tests.py · 설정: .coveragerc · 재실행 방법: README.</w:t>
-      </w:r>
-    </w:p>
-    <w:p>
-      <w:pPr>
-        <w:spacing w:before="0" w:after="120" w:line="264" w:lineRule="auto"/>
-      </w:pPr>
-      <w:r>
-        <w:rPr>
-          <w:b w:val="0"/>
-          <w:sz w:val="20"/>
-        </w:rPr>
-        <w:t>추가 점검: Git에 포함된 소스만으로 새 DB 초기화와 migration 일치 검사를 통과했다. 웹에서도 API와 같은 5MB·이미지 형식 제한을 적용한다. Android 빌드와 Lint는 통과했으며 오류 0개, 권고 경고 18개다.</w:t>
-      </w:r>
-    </w:p>
-    <w:p>
       <w:r>
         <w:br w:type="page"/>
       </w:r>
@@ -5651,20 +5316,20 @@
       <w:pPr>
         <w:pStyle w:val="aff8"/>
         <w:keepNext/>
-        <w:spacing w:after="240"/>
+        <w:spacing w:before="0" w:after="240"/>
       </w:pPr>
       <w:r>
         <w:rPr>
           <w:b/>
           <w:sz w:val="28"/>
         </w:rPr>
-        <w:t>증빙 6 소켓으로 받은 Android 요청</w:t>
+        <w:t>증빙 6 소켓 수신 파일</w:t>
       </w:r>
     </w:p>
     <w:p>
       <w:pPr>
-        <w:keepNext/>
-        <w:spacing w:after="80"/>
+        <w:keepNext w:val="0"/>
+        <w:spacing w:before="0" w:after="240"/>
       </w:pPr>
       <w:r>
         <w:drawing>
@@ -5702,56 +5367,6 @@
       </w:r>
     </w:p>
     <w:p>
-      <w:pPr>
-        <w:spacing w:before="0" w:after="120" w:line="264" w:lineRule="auto"/>
-      </w:pPr>
-      <w:r>
-        <w:rPr>
-          <w:b w:val="0"/>
-          <w:sz w:val="18"/>
-        </w:rPr>
-        <w:t>수신 파일 android-request.txt의 원문을 VS Code 웹 편집기에 붙여 확인한 화면.</w:t>
-      </w:r>
-    </w:p>
-    <w:p>
-      <w:pPr>
-        <w:spacing w:before="0" w:after="120" w:line="264" w:lineRule="auto"/>
-      </w:pPr>
-      <w:r>
-        <w:rPr>
-          <w:b w:val="0"/>
-          <w:sz w:val="22"/>
-        </w:rPr>
-        <w:t>앱이 http://10.0.2.2:8001/api_root/Post/ 에 실제 GET 요청을 보냈다. 소켓 서버가 바이트를 저장한 뒤 로컬 Django의 8000번 포트로 전달했다.</w:t>
-      </w:r>
-    </w:p>
-    <w:p>
-      <w:pPr>
-        <w:spacing w:before="0" w:after="120" w:line="264" w:lineRule="auto"/>
-      </w:pPr>
-      <w:r>
-        <w:rPr>
-          <w:b w:val="0"/>
-          <w:sz w:val="22"/>
-        </w:rPr>
-        <w:t>GET 경로, Accept: application/json, Android Dalvik User-Agent, Host: 10.0.2.2:8001을 확인했다. 원본 .bin은 수신 바이트 그대로이며 .txt는 줄바꿈을 정리한 확인용 사본이다.</w:t>
-      </w:r>
-    </w:p>
-    <w:p>
-      <w:pPr>
-        <w:spacing w:before="0" w:after="120" w:line="264" w:lineRule="auto"/>
-      </w:pPr>
-      <w:r>
-        <w:rPr>
-          <w:b w:val="0"/>
-          <w:sz w:val="20"/>
-        </w:rPr>
-        <w:t>파일: evidence/2026-10-13-15-25-19.bin</w:t>
-        <w:br/>
-        <w:t>코드: PhotoBlogServer/tools/capture_request.py</w:t>
-      </w:r>
-    </w:p>
-    <w:p>
       <w:r>
         <w:br w:type="page"/>
       </w:r>
@@ -5760,37 +5375,25 @@
       <w:pPr>
         <w:pStyle w:val="aff8"/>
         <w:keepNext/>
-        <w:spacing w:after="240"/>
+        <w:spacing w:before="0" w:after="240"/>
       </w:pPr>
       <w:r>
         <w:rPr>
           <w:b/>
           <w:sz w:val="28"/>
         </w:rPr>
-        <w:t>증빙 7 로컬 서버 웹 화면</w:t>
+        <w:t>증빙 7 로컬 서버</w:t>
       </w:r>
     </w:p>
     <w:p>
       <w:pPr>
-        <w:spacing w:before="0" w:after="120" w:line="264" w:lineRule="auto"/>
-      </w:pPr>
-      <w:r>
-        <w:rPr>
-          <w:b w:val="0"/>
-          <w:sz w:val="20"/>
-        </w:rPr>
-        <w:t>로컬 주소: http://127.0.0.1:8000/</w:t>
-      </w:r>
-    </w:p>
-    <w:p>
-      <w:pPr>
-        <w:keepNext/>
-        <w:spacing w:after="80"/>
+        <w:keepNext w:val="0"/>
+        <w:spacing w:before="0" w:after="240"/>
       </w:pPr>
       <w:r>
         <w:drawing>
           <wp:inline xmlns:a="http://schemas.openxmlformats.org/drawingml/2006/main" xmlns:pic="http://schemas.openxmlformats.org/drawingml/2006/picture">
-            <wp:extent cx="4352081" cy="4571999"/>
+            <wp:extent cx="5849620" cy="6145212"/>
             <wp:docPr id="9" name="Picture 9"/>
             <wp:cNvGraphicFramePr>
               <a:graphicFrameLocks noChangeAspect="1"/>
@@ -5811,7 +5414,7 @@
                   <pic:spPr>
                     <a:xfrm>
                       <a:off x="0" y="0"/>
-                      <a:ext cx="4352081" cy="4571999"/>
+                      <a:ext cx="5849620" cy="6145212"/>
                     </a:xfrm>
                     <a:prstGeom prst="rect"/>
                   </pic:spPr>
@@ -5823,30 +5426,6 @@
       </w:r>
     </w:p>
     <w:p>
-      <w:pPr>
-        <w:spacing w:before="0" w:after="120" w:line="264" w:lineRule="auto"/>
-      </w:pPr>
-      <w:r>
-        <w:rPr>
-          <w:b w:val="0"/>
-          <w:sz w:val="18"/>
-        </w:rPr>
-        <w:t>로컬 웹 목록 상단. API 폼과 Android에서 업로드한 두 고양이 게시글이 함께 표시된다.</w:t>
-      </w:r>
-    </w:p>
-    <w:p>
-      <w:pPr>
-        <w:spacing w:before="0" w:after="120" w:line="264" w:lineRule="auto"/>
-      </w:pPr>
-      <w:r>
-        <w:rPr>
-          <w:b w:val="0"/>
-          <w:sz w:val="22"/>
-        </w:rPr>
-        <w:t>Android와 웹 브라우저가 동일한 Django 게시글과 미디어 파일을 사용한다. 목록의 제목·본문 검색과 상세 이미지 표시도 구현했다.</w:t>
-      </w:r>
-    </w:p>
-    <w:p>
       <w:r>
         <w:br w:type="page"/>
       </w:r>
@@ -5855,26 +5434,25 @@
       <w:pPr>
         <w:pStyle w:val="aff8"/>
         <w:keepNext/>
-        <w:spacing w:after="240"/>
+        <w:spacing w:before="0" w:after="240"/>
       </w:pPr>
       <w:r>
         <w:rPr>
           <w:b/>
           <w:sz w:val="28"/>
         </w:rPr>
-        <w:t>증빙 8 Android 시작과 동기화</w:t>
+        <w:t>증빙 8 클라이언트 시작 및 동기화</w:t>
       </w:r>
     </w:p>
     <w:p>
       <w:pPr>
-        <w:keepNext/>
-        <w:spacing w:after="120"/>
+        <w:spacing w:after="0"/>
         <w:jc w:val="center"/>
       </w:pPr>
       <w:r>
         <w:drawing>
           <wp:inline xmlns:a="http://schemas.openxmlformats.org/drawingml/2006/main" xmlns:pic="http://schemas.openxmlformats.org/drawingml/2006/picture">
-            <wp:extent cx="2432304" cy="5405120"/>
+            <wp:extent cx="2560320" cy="5689600"/>
             <wp:docPr id="10" name="Picture 10"/>
             <wp:cNvGraphicFramePr>
               <a:graphicFrameLocks noChangeAspect="1"/>
@@ -5895,7 +5473,7 @@
                   <pic:spPr>
                     <a:xfrm>
                       <a:off x="0" y="0"/>
-                      <a:ext cx="2432304" cy="5405120"/>
+                      <a:ext cx="2560320" cy="5689600"/>
                     </a:xfrm>
                     <a:prstGeom prst="rect"/>
                   </pic:spPr>
@@ -5911,7 +5489,7 @@
       <w:r>
         <w:drawing>
           <wp:inline xmlns:a="http://schemas.openxmlformats.org/drawingml/2006/main" xmlns:pic="http://schemas.openxmlformats.org/drawingml/2006/picture">
-            <wp:extent cx="2432304" cy="5405120"/>
+            <wp:extent cx="2560320" cy="5689600"/>
             <wp:docPr id="11" name="Picture 11"/>
             <wp:cNvGraphicFramePr>
               <a:graphicFrameLocks noChangeAspect="1"/>
@@ -5932,7 +5510,7 @@
                   <pic:spPr>
                     <a:xfrm>
                       <a:off x="0" y="0"/>
-                      <a:ext cx="2432304" cy="5405120"/>
+                      <a:ext cx="2560320" cy="5689600"/>
                     </a:xfrm>
                     <a:prstGeom prst="rect"/>
                   </pic:spPr>
@@ -5944,30 +5522,6 @@
       </w:r>
     </w:p>
     <w:p>
-      <w:pPr>
-        <w:spacing w:before="0" w:after="120" w:line="264" w:lineRule="auto"/>
-      </w:pPr>
-      <w:r>
-        <w:rPr>
-          <w:b w:val="0"/>
-          <w:sz w:val="20"/>
-        </w:rPr>
-        <w:t>왼쪽: 새 앱 데이터로 시작한 화면. 오른쪽: 로컬 Django의 사진 목록을 동기화한 화면.</w:t>
-      </w:r>
-    </w:p>
-    <w:p>
-      <w:pPr>
-        <w:spacing w:before="0" w:after="120" w:line="264" w:lineRule="auto"/>
-      </w:pPr>
-      <w:r>
-        <w:rPr>
-          <w:b w:val="0"/>
-          <w:sz w:val="20"/>
-        </w:rPr>
-        <w:t>Android 16(API 36) 에뮬레이터에서 실제 실행했다. 10.0.2.2는 에뮬레이터에서 PC의 loopback 서버를 가리킨다.</w:t>
-      </w:r>
-    </w:p>
-    <w:p>
       <w:r>
         <w:br w:type="page"/>
       </w:r>
@@ -5976,26 +5530,25 @@
       <w:pPr>
         <w:pStyle w:val="aff8"/>
         <w:keepNext/>
-        <w:spacing w:after="240"/>
+        <w:spacing w:before="0" w:after="240"/>
       </w:pPr>
       <w:r>
         <w:rPr>
           <w:b/>
           <w:sz w:val="28"/>
         </w:rPr>
-        <w:t>증빙 9 입력 UI를 이용한 사진 업로드</w:t>
+        <w:t>증빙 9 사진 업로드</w:t>
       </w:r>
     </w:p>
     <w:p>
       <w:pPr>
-        <w:keepNext/>
-        <w:spacing w:after="120"/>
+        <w:spacing w:after="0"/>
         <w:jc w:val="center"/>
       </w:pPr>
       <w:r>
         <w:drawing>
           <wp:inline xmlns:a="http://schemas.openxmlformats.org/drawingml/2006/main" xmlns:pic="http://schemas.openxmlformats.org/drawingml/2006/picture">
-            <wp:extent cx="2432304" cy="5405120"/>
+            <wp:extent cx="2560320" cy="5689600"/>
             <wp:docPr id="12" name="Picture 12"/>
             <wp:cNvGraphicFramePr>
               <a:graphicFrameLocks noChangeAspect="1"/>
@@ -6016,7 +5569,7 @@
                   <pic:spPr>
                     <a:xfrm>
                       <a:off x="0" y="0"/>
-                      <a:ext cx="2432304" cy="5405120"/>
+                      <a:ext cx="2560320" cy="5689600"/>
                     </a:xfrm>
                     <a:prstGeom prst="rect"/>
                   </pic:spPr>
@@ -6032,7 +5585,7 @@
       <w:r>
         <w:drawing>
           <wp:inline xmlns:a="http://schemas.openxmlformats.org/drawingml/2006/main" xmlns:pic="http://schemas.openxmlformats.org/drawingml/2006/picture">
-            <wp:extent cx="2432304" cy="5405120"/>
+            <wp:extent cx="2560320" cy="5689600"/>
             <wp:docPr id="13" name="Picture 13"/>
             <wp:cNvGraphicFramePr>
               <a:graphicFrameLocks noChangeAspect="1"/>
@@ -6053,7 +5606,7 @@
                   <pic:spPr>
                     <a:xfrm>
                       <a:off x="0" y="0"/>
-                      <a:ext cx="2432304" cy="5405120"/>
+                      <a:ext cx="2560320" cy="5689600"/>
                     </a:xfrm>
                     <a:prstGeom prst="rect"/>
                   </pic:spPr>
@@ -6065,42 +5618,6 @@
       </w:r>
     </w:p>
     <w:p>
-      <w:pPr>
-        <w:spacing w:before="0" w:after="120" w:line="264" w:lineRule="auto"/>
-      </w:pPr>
-      <w:r>
-        <w:rPr>
-          <w:b w:val="0"/>
-          <w:sz w:val="20"/>
-        </w:rPr>
-        <w:t>왼쪽: 제목·본문·사진 입력 UI. 오른쪽: POST 완료 후 새 게시글이 표시된 목록.</w:t>
-      </w:r>
-    </w:p>
-    <w:p>
-      <w:pPr>
-        <w:spacing w:before="0" w:after="120" w:line="264" w:lineRule="auto"/>
-      </w:pPr>
-      <w:r>
-        <w:rPr>
-          <w:b w:val="0"/>
-          <w:sz w:val="20"/>
-        </w:rPr>
-        <w:t>평가 항목의 UI 제공 방식(상)을 선택했다. Android의 콘텐츠 URI에서 이미지 바이트를 읽어 multipart POST로 전송하고 성공 후 목록을 다시 동기화한다. 하드코딩 방식은 선택하지 않았다.</w:t>
-      </w:r>
-    </w:p>
-    <w:p>
-      <w:pPr>
-        <w:spacing w:before="0" w:after="120" w:line="264" w:lineRule="auto"/>
-      </w:pPr>
-      <w:r>
-        <w:rPr>
-          <w:b w:val="0"/>
-          <w:sz w:val="20"/>
-        </w:rPr>
-        <w:t>기기 자동 테스트는 사진 선택 결과 URI를 주입한 뒤 실제 앱 업로드 경로와 서버 저장을 검증했다.</w:t>
-      </w:r>
-    </w:p>
-    <w:p>
       <w:r>
         <w:br w:type="page"/>
       </w:r>
@@ -6109,20 +5626,20 @@
       <w:pPr>
         <w:pStyle w:val="aff8"/>
         <w:keepNext/>
-        <w:spacing w:after="240"/>
+        <w:spacing w:before="0" w:after="240"/>
       </w:pPr>
       <w:r>
         <w:rPr>
           <w:b/>
           <w:sz w:val="28"/>
         </w:rPr>
-        <w:t>증빙 10 PythonAnywhere 서버</w:t>
+        <w:t>증빙 10 클라우드 서버</w:t>
       </w:r>
     </w:p>
     <w:p>
       <w:pPr>
-        <w:keepNext/>
-        <w:spacing w:after="80"/>
+        <w:keepNext w:val="0"/>
+        <w:spacing w:before="0" w:after="240"/>
       </w:pPr>
       <w:r>
         <w:drawing>
@@ -6160,54 +5677,6 @@
       </w:r>
     </w:p>
     <w:p>
-      <w:pPr>
-        <w:spacing w:before="0" w:after="120" w:line="264" w:lineRule="auto"/>
-      </w:pPr>
-      <w:r>
-        <w:rPr>
-          <w:b w:val="0"/>
-          <w:sz w:val="18"/>
-        </w:rPr>
-        <w:t>클라우드 웹: https://gyusik.pythonanywhere.com/</w:t>
-      </w:r>
-    </w:p>
-    <w:p>
-      <w:pPr>
-        <w:spacing w:before="0" w:after="120" w:line="264" w:lineRule="auto"/>
-      </w:pPr>
-      <w:r>
-        <w:rPr>
-          <w:b w:val="0"/>
-          <w:sz w:val="18"/>
-        </w:rPr>
-        <w:t>새 WSGI 경로와 static/media 매핑을 적용했고 DEBUG를 비활성화했다. 기존 프로젝트와 WSGI 백업은 보존했다.</w:t>
-      </w:r>
-    </w:p>
-    <w:p>
-      <w:pPr>
-        <w:spacing w:before="0" w:after="120" w:line="264" w:lineRule="auto"/>
-      </w:pPr>
-      <w:r>
-        <w:rPr>
-          <w:b w:val="0"/>
-          <w:sz w:val="20"/>
-        </w:rPr>
-        <w:t>실습 사진은 제공받은 icon_5.png와 뭐여.png 원본을 사용했다. 저장소에서는 cat_annoyed.png와 cat_what.png로 보관하고 웹과 앱에서 전체 그림이 보이도록 표시한다.</w:t>
-      </w:r>
-    </w:p>
-    <w:p>
-      <w:pPr>
-        <w:spacing w:before="0" w:after="120" w:line="264" w:lineRule="auto"/>
-      </w:pPr>
-      <w:r>
-        <w:rPr>
-          <w:b w:val="0"/>
-          <w:sz w:val="20"/>
-        </w:rPr>
-        <w:t>2026년 10월 13일 공개 HTTPS 응답, 이미지 원본 일치, 비로그인 작성 차단과 관리자 로그인 보호를 재확인했다. 무료 사이트 유지 기한은 2026년 11월 13일이며 이후에는 Web 탭에서 갱신한다.</w:t>
-      </w:r>
-    </w:p>
-    <w:p>
       <w:r>
         <w:br w:type="page"/>
       </w:r>
@@ -6216,25 +5685,25 @@
       <w:pPr>
         <w:pStyle w:val="aff8"/>
         <w:keepNext/>
-        <w:spacing w:after="240"/>
+        <w:spacing w:before="0" w:after="240"/>
       </w:pPr>
       <w:r>
         <w:rPr>
           <w:b/>
           <w:sz w:val="28"/>
         </w:rPr>
-        <w:t>증빙 10 클라우드 동기화 결과</w:t>
+        <w:t>증빙 10 클라우드 클라이언트</w:t>
       </w:r>
     </w:p>
     <w:p>
       <w:pPr>
-        <w:keepNext/>
-        <w:spacing w:after="80"/>
+        <w:keepNext w:val="0"/>
+        <w:spacing w:before="0" w:after="240"/>
       </w:pPr>
       <w:r>
         <w:drawing>
           <wp:inline xmlns:a="http://schemas.openxmlformats.org/drawingml/2006/main" xmlns:pic="http://schemas.openxmlformats.org/drawingml/2006/picture">
-            <wp:extent cx="2592324" cy="5760720"/>
+            <wp:extent cx="2962656" cy="6583680"/>
             <wp:docPr id="15" name="Picture 15"/>
             <wp:cNvGraphicFramePr>
               <a:graphicFrameLocks noChangeAspect="1"/>
@@ -6255,7 +5724,7 @@
                   <pic:spPr>
                     <a:xfrm>
                       <a:off x="0" y="0"/>
-                      <a:ext cx="2592324" cy="5760720"/>
+                      <a:ext cx="2962656" cy="6583680"/>
                     </a:xfrm>
                     <a:prstGeom prst="rect"/>
                   </pic:spPr>
@@ -6267,30 +5736,6 @@
       </w:r>
     </w:p>
     <w:p>
-      <w:pPr>
-        <w:spacing w:before="0" w:after="120" w:line="264" w:lineRule="auto"/>
-      </w:pPr>
-      <w:r>
-        <w:rPr>
-          <w:b w:val="0"/>
-          <w:sz w:val="18"/>
-        </w:rPr>
-        <w:t>Android 설정의 클라우드 주소로 접속해 HTTPS 동기화 완료.</w:t>
-      </w:r>
-    </w:p>
-    <w:p>
-      <w:pPr>
-        <w:spacing w:before="0" w:after="120" w:line="264" w:lineRule="auto"/>
-      </w:pPr>
-      <w:r>
-        <w:rPr>
-          <w:b w:val="0"/>
-          <w:sz w:val="20"/>
-        </w:rPr>
-        <w:t>에뮬레이터에서 공개 HTTPS API를 호출해 게시글 JSON과 이미지를 함께 내려받았다.</w:t>
-      </w:r>
-    </w:p>
-    <w:p>
       <w:r>
         <w:br w:type="page"/>
       </w:r>
@@ -6299,26 +5744,25 @@
       <w:pPr>
         <w:pStyle w:val="aff8"/>
         <w:keepNext/>
-        <w:spacing w:after="240"/>
+        <w:spacing w:before="0" w:after="240"/>
       </w:pPr>
       <w:r>
         <w:rPr>
           <w:b/>
           <w:sz w:val="28"/>
         </w:rPr>
-        <w:t>증빙 11 연결 설정과 검색</w:t>
+        <w:t>증빙 11 연결 설정 및 검색</w:t>
       </w:r>
     </w:p>
     <w:p>
       <w:pPr>
-        <w:keepNext/>
-        <w:spacing w:after="120"/>
+        <w:spacing w:after="0"/>
         <w:jc w:val="center"/>
       </w:pPr>
       <w:r>
         <w:drawing>
           <wp:inline xmlns:a="http://schemas.openxmlformats.org/drawingml/2006/main" xmlns:pic="http://schemas.openxmlformats.org/drawingml/2006/picture">
-            <wp:extent cx="2432304" cy="5405120"/>
+            <wp:extent cx="2560320" cy="5689600"/>
             <wp:docPr id="16" name="Picture 16"/>
             <wp:cNvGraphicFramePr>
               <a:graphicFrameLocks noChangeAspect="1"/>
@@ -6339,7 +5783,7 @@
                   <pic:spPr>
                     <a:xfrm>
                       <a:off x="0" y="0"/>
-                      <a:ext cx="2432304" cy="5405120"/>
+                      <a:ext cx="2560320" cy="5689600"/>
                     </a:xfrm>
                     <a:prstGeom prst="rect"/>
                   </pic:spPr>
@@ -6355,7 +5799,7 @@
       <w:r>
         <w:drawing>
           <wp:inline xmlns:a="http://schemas.openxmlformats.org/drawingml/2006/main" xmlns:pic="http://schemas.openxmlformats.org/drawingml/2006/picture">
-            <wp:extent cx="2432304" cy="5405120"/>
+            <wp:extent cx="2560320" cy="5689600"/>
             <wp:docPr id="17" name="Picture 17"/>
             <wp:cNvGraphicFramePr>
               <a:graphicFrameLocks noChangeAspect="1"/>
@@ -6376,7 +5820,7 @@
                   <pic:spPr>
                     <a:xfrm>
                       <a:off x="0" y="0"/>
-                      <a:ext cx="2432304" cy="5405120"/>
+                      <a:ext cx="2560320" cy="5689600"/>
                     </a:xfrm>
                     <a:prstGeom prst="rect"/>
                   </pic:spPr>
@@ -6388,30 +5832,6 @@
       </w:r>
     </w:p>
     <w:p>
-      <w:pPr>
-        <w:spacing w:before="0" w:after="120" w:line="264" w:lineRule="auto"/>
-      </w:pPr>
-      <w:r>
-        <w:rPr>
-          <w:b w:val="0"/>
-          <w:sz w:val="20"/>
-        </w:rPr>
-        <w:t>왼쪽: 로컬/클라우드 프리셋과 연결 설정. 오른쪽: 제목·본문의 입력 즉시 검색.</w:t>
-      </w:r>
-    </w:p>
-    <w:p>
-      <w:pPr>
-        <w:spacing w:before="0" w:after="120" w:line="264" w:lineRule="auto"/>
-      </w:pPr>
-      <w:r>
-        <w:rPr>
-          <w:b w:val="0"/>
-          <w:sz w:val="20"/>
-        </w:rPr>
-        <w:t>편의 기능 1: 서버 주소와 인증 토큰을 서버별로 저장한다. 편의 기능 2: 내려받은 목록을 검색어로 필터링한다.</w:t>
-      </w:r>
-    </w:p>
-    <w:p>
       <w:r>
         <w:br w:type="page"/>
       </w:r>
@@ -6420,26 +5840,25 @@
       <w:pPr>
         <w:pStyle w:val="aff8"/>
         <w:keepNext/>
-        <w:spacing w:after="240"/>
+        <w:spacing w:before="0" w:after="240"/>
       </w:pPr>
       <w:r>
         <w:rPr>
           <w:b/>
           <w:sz w:val="28"/>
         </w:rPr>
-        <w:t>증빙 12 상세 보기와 캐시 복원</w:t>
+        <w:t>증빙 12 상세 보기 및 캐시 복원</w:t>
       </w:r>
     </w:p>
     <w:p>
       <w:pPr>
-        <w:keepNext/>
-        <w:spacing w:after="120"/>
+        <w:spacing w:after="0"/>
         <w:jc w:val="center"/>
       </w:pPr>
       <w:r>
         <w:drawing>
           <wp:inline xmlns:a="http://schemas.openxmlformats.org/drawingml/2006/main" xmlns:pic="http://schemas.openxmlformats.org/drawingml/2006/picture">
-            <wp:extent cx="2432304" cy="5405120"/>
+            <wp:extent cx="2560320" cy="5689600"/>
             <wp:docPr id="18" name="Picture 18"/>
             <wp:cNvGraphicFramePr>
               <a:graphicFrameLocks noChangeAspect="1"/>
@@ -6460,7 +5879,7 @@
                   <pic:spPr>
                     <a:xfrm>
                       <a:off x="0" y="0"/>
-                      <a:ext cx="2432304" cy="5405120"/>
+                      <a:ext cx="2560320" cy="5689600"/>
                     </a:xfrm>
                     <a:prstGeom prst="rect"/>
                   </pic:spPr>
@@ -6476,7 +5895,7 @@
       <w:r>
         <w:drawing>
           <wp:inline xmlns:a="http://schemas.openxmlformats.org/drawingml/2006/main" xmlns:pic="http://schemas.openxmlformats.org/drawingml/2006/picture">
-            <wp:extent cx="2432304" cy="5405120"/>
+            <wp:extent cx="2560320" cy="5689600"/>
             <wp:docPr id="19" name="Picture 19"/>
             <wp:cNvGraphicFramePr>
               <a:graphicFrameLocks noChangeAspect="1"/>
@@ -6497,7 +5916,7 @@
                   <pic:spPr>
                     <a:xfrm>
                       <a:off x="0" y="0"/>
-                      <a:ext cx="2432304" cy="5405120"/>
+                      <a:ext cx="2560320" cy="5689600"/>
                     </a:xfrm>
                     <a:prstGeom prst="rect"/>
                   </pic:spPr>
@@ -6509,30 +5928,6 @@
       </w:r>
     </w:p>
     <w:p>
-      <w:pPr>
-        <w:spacing w:before="0" w:after="120" w:line="264" w:lineRule="auto"/>
-      </w:pPr>
-      <w:r>
-        <w:rPr>
-          <w:b w:val="0"/>
-          <w:sz w:val="20"/>
-        </w:rPr>
-        <w:t>왼쪽: 선택한 사진의 상세 본문과 작성자. 오른쪽: 앱 재시작 후 보관한 목록을 복원한 화면.</w:t>
-      </w:r>
-    </w:p>
-    <w:p>
-      <w:pPr>
-        <w:spacing w:before="0" w:after="120" w:line="264" w:lineRule="auto"/>
-      </w:pPr>
-      <w:r>
-        <w:rPr>
-          <w:b w:val="0"/>
-          <w:sz w:val="20"/>
-        </w:rPr>
-        <w:t>편의 기능 3: 큰 이미지와 전체 본문을 표시한다. 편의 기능 4: 서버별 목록 JSON과 이미지 캐시를 사용해 재실행 시 보관 내용을 보여 준다.</w:t>
-      </w:r>
-    </w:p>
-    <w:p>
       <w:r>
         <w:br w:type="page"/>
       </w:r>
@@ -6541,25 +5936,25 @@
       <w:pPr>
         <w:pStyle w:val="aff8"/>
         <w:keepNext/>
-        <w:spacing w:after="240"/>
+        <w:spacing w:before="0" w:after="240"/>
       </w:pPr>
       <w:r>
         <w:rPr>
           <w:b/>
           <w:sz w:val="28"/>
         </w:rPr>
-        <w:t>증빙 13 작성 중인 초안 복원</w:t>
+        <w:t>증빙 13 작성 초안 복원</w:t>
       </w:r>
     </w:p>
     <w:p>
       <w:pPr>
-        <w:keepNext/>
-        <w:spacing w:after="80"/>
+        <w:keepNext w:val="0"/>
+        <w:spacing w:before="0" w:after="240"/>
       </w:pPr>
       <w:r>
         <w:drawing>
           <wp:inline xmlns:a="http://schemas.openxmlformats.org/drawingml/2006/main" xmlns:pic="http://schemas.openxmlformats.org/drawingml/2006/picture">
-            <wp:extent cx="2592324" cy="5760720"/>
+            <wp:extent cx="2962656" cy="6583680"/>
             <wp:docPr id="20" name="Picture 20"/>
             <wp:cNvGraphicFramePr>
               <a:graphicFrameLocks noChangeAspect="1"/>
@@ -6580,7 +5975,7 @@
                   <pic:spPr>
                     <a:xfrm>
                       <a:off x="0" y="0"/>
-                      <a:ext cx="2592324" cy="5760720"/>
+                      <a:ext cx="2962656" cy="6583680"/>
                     </a:xfrm>
                     <a:prstGeom prst="rect"/>
                   </pic:spPr>
@@ -6589,42 +5984,6 @@
             </a:graphic>
           </wp:inline>
         </w:drawing>
-      </w:r>
-    </w:p>
-    <w:p>
-      <w:pPr>
-        <w:spacing w:before="0" w:after="120" w:line="264" w:lineRule="auto"/>
-      </w:pPr>
-      <w:r>
-        <w:rPr>
-          <w:b w:val="0"/>
-          <w:sz w:val="18"/>
-        </w:rPr>
-        <w:t>작성 창을 닫았다 다시 열었을 때 제목과 본문이 유지된다.</w:t>
-      </w:r>
-    </w:p>
-    <w:p>
-      <w:pPr>
-        <w:spacing w:before="0" w:after="120" w:line="264" w:lineRule="auto"/>
-      </w:pPr>
-      <w:r>
-        <w:rPr>
-          <w:b w:val="0"/>
-          <w:sz w:val="20"/>
-        </w:rPr>
-        <w:t>편의 기능 5: 제목과 본문을 임시 저장한다. 사진 선택은 작성 창을 닫았다 다시 여는 동안 유지하며, 앱 종료나 화면 재생성 후에는 다시 선택한다. 업로드가 완료되면 초안을 비운다.</w:t>
-      </w:r>
-    </w:p>
-    <w:p>
-      <w:pPr>
-        <w:spacing w:before="0" w:after="120" w:line="264" w:lineRule="auto"/>
-      </w:pPr>
-      <w:r>
-        <w:rPr>
-          <w:b w:val="0"/>
-          <w:sz w:val="20"/>
-        </w:rPr>
-        <w:t>추가 기기 검사에서 화면 재생성 후 제목·본문 복원과 지연된 업로드 응답 도착 시 앱 유지도 통과했다. 서버별 토큰 분리와 삭제를 함께 확인했다. 테스트: EvidenceRunner의 audit 모드.</w:t>
       </w:r>
     </w:p>
     <w:sectPr>

</xml_diff>